<commit_message>
Add revision roadmap for case report on pelvic epidermoid cyst
- Introduced a comprehensive roadmap detailing the phases of review and feedback from multiple reviewers.
- Included assessments of paper profile, reviewer configurations, and individual reviewer comments.
- Highlighted critical issues requiring resolution before resubmission, including missing histopathology figure and concerns regarding the diagnostic triad.
- Outlined additional major and minor revisions needed to enhance the manuscript's clarity and rigor.
</commit_message>
<xml_diff>
--- a/Case_Report_Epidermoid_Cyst_raw.docx
+++ b/Case_Report_Epidermoid_Cyst_raw.docx
@@ -55,13 +55,7 @@
         <w:t xml:space="preserve"> </w:t>
       </w:r>
       <w:r>
-        <w:t xml:space="preserve">E-mail: </w:t>
-      </w:r>
-      <w:r>
-        <w:rPr>
-          <w:rFonts w:hint="eastAsia"/>
-        </w:rPr>
-        <w:t xml:space="preserve">[待補]</w:t>
+        <w:t xml:space="preserve">E-mail: cgh07668@cgh.org.tw</w:t>
       </w:r>
     </w:p>
     <w:p>
@@ -134,25 +128,31 @@
         <w:t xml:space="preserve"> </w:t>
       </w:r>
       <w:r>
-        <w:t xml:space="preserve">(CEA, AFP, CA19-9), and absent mass enhancement on CT. Concurrent left</w:t>
-      </w:r>
-      <w:r>
-        <w:t xml:space="preserve"> </w:t>
-      </w:r>
-      <w:r>
-        <w:t xml:space="preserve">hydronephrosis was managed with pre-operative ureteral stenting.</w:t>
-      </w:r>
-      <w:r>
-        <w:t xml:space="preserve"> </w:t>
-      </w:r>
-      <w:r>
-        <w:t xml:space="preserve">Laparotomy with complete excision confirmed an epidermoid cyst on</w:t>
-      </w:r>
-      <w:r>
-        <w:t xml:space="preserve"> </w:t>
-      </w:r>
-      <w:r>
-        <w:t xml:space="preserve">histopathology.</w:t>
+        <w:t xml:space="preserve">(CEA, AFP, CA19-9), and absent mass enhancement on CT. Prophylactic ureteral stenting was placed pre-operatively given the</w:t>
+      </w:r>
+      <w:r>
+        <w:t xml:space="preserve"> </w:t>
+      </w:r>
+      <w:r>
+        <w:t xml:space="preserve">mass’s proximity to the left ureter. Laparotomy with complete excision</w:t>
+      </w:r>
+      <w:r>
+        <w:t xml:space="preserve"> </w:t>
+      </w:r>
+      <w:r>
+        <w:t xml:space="preserve">confirmed an epidermoid cyst; histopathology demonstrated a cyst wall</w:t>
+      </w:r>
+      <w:r>
+        <w:t xml:space="preserve"> </w:t>
+      </w:r>
+      <w:r>
+        <w:t xml:space="preserve">lined by keratinized stratified squamous epithelium without adnexal</w:t>
+      </w:r>
+      <w:r>
+        <w:t xml:space="preserve"> </w:t>
+      </w:r>
+      <w:r>
+        <w:t xml:space="preserve">structures.</w:t>
       </w:r>
     </w:p>
     <w:p>
@@ -268,7 +268,7 @@
         <w:rPr>
           <w:rFonts w:hint="eastAsia"/>
         </w:rPr>
-        <w:t xml:space="preserve">A19-9）均在正常範圍，以及CT對比增強掃描下腫塊未見強化。合併左輸尿管水腎症，術前置入雙J管以保護輸尿管。患者接受剖腹手術完整切除骨盆底腫塊，病理報告確認為硬皮囊腫，內壁為角化鱗狀上皮，含角蛋白碎片及纖維囊壁，無皮膚附屬器構造。</w:t>
+        <w:t xml:space="preserve">A19-9）均在正常範圍，以及CT對比增強掃描下腫塊未見強化。考量腫塊緊鄰左輸尿管，術前預防性置入雙J管，術中確認左側輸水腎症。患者接受剖腹手術完整切除骨盆底腫塊，病理報告確認為硬皮囊腫，內壁為角化鱗狀上皮，含角蛋白碎片及纖維囊壁，無皮膚附屬器構造。</w:t>
       </w:r>
     </w:p>
     <w:p>
@@ -335,55 +335,67 @@
         <w:pStyle w:val="FirstParagraph"/>
       </w:pPr>
       <w:r>
-        <w:t xml:space="preserve">Epidermoid cysts within the pelvic floor or retroperitoneum are</w:t>
-      </w:r>
-      <w:r>
-        <w:t xml:space="preserve"> </w:t>
-      </w:r>
-      <w:r>
-        <w:t xml:space="preserve">exceedingly rare, with fewer than 20 cases reported in the literature</w:t>
-      </w:r>
-      <w:r>
-        <w:t xml:space="preserve"> </w:t>
-      </w:r>
-      <w:r>
-        <w:t xml:space="preserve">based on a narrative review of available case reports (Fdili Alaoui</w:t>
-      </w:r>
-      <w:r>
-        <w:t xml:space="preserve"> </w:t>
-      </w:r>
-      <w:r>
-        <w:t xml:space="preserve">et al., 2012; Jain &amp; Pal, 2018; Nasim et al., 2020). Embryological</w:t>
-      </w:r>
-      <w:r>
-        <w:t xml:space="preserve"> </w:t>
-      </w:r>
-      <w:r>
-        <w:t xml:space="preserve">sequestration of ectopic epidermal rests is the most plausible</w:t>
-      </w:r>
-      <w:r>
-        <w:t xml:space="preserve"> </w:t>
-      </w:r>
-      <w:r>
-        <w:t xml:space="preserve">pathogenic mechanism in patients without prior trauma or surgery</w:t>
-      </w:r>
-      <w:r>
-        <w:t xml:space="preserve"> </w:t>
-      </w:r>
-      <w:r>
-        <w:t xml:space="preserve">(Hyseni et al., 2009). Their capacity to grow large and compress</w:t>
-      </w:r>
-      <w:r>
-        <w:t xml:space="preserve"> </w:t>
-      </w:r>
-      <w:r>
-        <w:t xml:space="preserve">adjacent pelvic structures frequently leads to misdiagnosis as</w:t>
-      </w:r>
-      <w:r>
-        <w:t xml:space="preserve"> </w:t>
-      </w:r>
-      <w:r>
-        <w:t xml:space="preserve">malignancy (Fdili Alaoui et al., 2012; Bates et al., 2019). We report</w:t>
+        <w:t xml:space="preserve">Epidermoid cysts within the pelvic floor are exceedingly rare, with</w:t>
+      </w:r>
+      <w:r>
+        <w:t xml:space="preserve"> </w:t>
+      </w:r>
+      <w:r>
+        <w:t xml:space="preserve">fewer than 20 cases reported in the literature through 2024.</w:t>
+      </w:r>
+      <w:r>
+        <w:rPr>
+          <w:vertAlign w:val="superscript"/>
+        </w:rPr>
+        <w:t xml:space="preserve">1–3</w:t>
+      </w:r>
+      <w:r>
+        <w:t xml:space="preserve"> </w:t>
+      </w:r>
+      <w:r>
+        <w:t xml:space="preserve">Embryological sequestration of ectopic epidermal rests is the most</w:t>
+      </w:r>
+      <w:r>
+        <w:t xml:space="preserve"> </w:t>
+      </w:r>
+      <w:r>
+        <w:t xml:space="preserve">plausible pathogenic mechanism.</w:t>
+      </w:r>
+      <w:r>
+        <w:rPr>
+          <w:vertAlign w:val="superscript"/>
+        </w:rPr>
+        <w:t xml:space="preserve">4</w:t>
+      </w:r>
+      <w:r>
+        <w:t xml:space="preserve"> </w:t>
+      </w:r>
+      <w:r>
+        <w:t xml:space="preserve">Their capacity</w:t>
+      </w:r>
+      <w:r>
+        <w:t xml:space="preserve"> </w:t>
+      </w:r>
+      <w:r>
+        <w:t xml:space="preserve">to grow large and compress adjacent pelvic structures frequently leads</w:t>
+      </w:r>
+      <w:r>
+        <w:t xml:space="preserve"> </w:t>
+      </w:r>
+      <w:r>
+        <w:t xml:space="preserve">to misdiagnosis as malignancy.</w:t>
+      </w:r>
+      <w:r>
+        <w:rPr>
+          <w:vertAlign w:val="superscript"/>
+        </w:rPr>
+        <w:t xml:space="preserve">1,5</w:t>
+      </w:r>
+      <w:r>
+        <w:t xml:space="preserve"> </w:t>
+      </w:r>
+      <w:r>
+        <w:t xml:space="preserve">We report</w:t>
       </w:r>
       <w:r>
         <w:t xml:space="preserve"> </w:t>
@@ -427,31 +439,31 @@
         <w:t xml:space="preserve"> </w:t>
       </w:r>
       <w:r>
-        <w:t xml:space="preserve">abdominal pain of two weeks' duration and hematuria detected via</w:t>
-      </w:r>
-      <w:r>
-        <w:t xml:space="preserve"> </w:t>
-      </w:r>
-      <w:r>
-        <w:t xml:space="preserve">urinary catheter for one week. He reported bowel habit changes with</w:t>
-      </w:r>
-      <w:r>
-        <w:t xml:space="preserve"> </w:t>
-      </w:r>
-      <w:r>
-        <w:t xml:space="preserve">diarrhea and rectal tenesmus over the preceding two months. He had no</w:t>
-      </w:r>
-      <w:r>
-        <w:t xml:space="preserve"> </w:t>
-      </w:r>
-      <w:r>
-        <w:t xml:space="preserve">weight loss, fever, or family history of malignancy. Vital signs on</w:t>
-      </w:r>
-      <w:r>
-        <w:t xml:space="preserve"> </w:t>
-      </w:r>
-      <w:r>
-        <w:t xml:space="preserve">arrival demonstrated hypertension (blood pressure 168/112 mmHg).</w:t>
+        <w:t xml:space="preserve">abdominal pain of two weeks’ duration and hematuria identified on</w:t>
+      </w:r>
+      <w:r>
+        <w:t xml:space="preserve"> </w:t>
+      </w:r>
+      <w:r>
+        <w:t xml:space="preserve">admission urinary catheterisation for one week. He reported bowel habit</w:t>
+      </w:r>
+      <w:r>
+        <w:t xml:space="preserve"> </w:t>
+      </w:r>
+      <w:r>
+        <w:t xml:space="preserve">changes with diarrhea and rectal tenesmus over the preceding two months.</w:t>
+      </w:r>
+      <w:r>
+        <w:t xml:space="preserve"> </w:t>
+      </w:r>
+      <w:r>
+        <w:t xml:space="preserve">He denied weight loss, fever, or family history of malignancy; blood</w:t>
+      </w:r>
+      <w:r>
+        <w:t xml:space="preserve"> </w:t>
+      </w:r>
+      <w:r>
+        <w:t xml:space="preserve">pressure on arrival was 168/112 mmHg.</w:t>
       </w:r>
       <w:r>
         <w:t xml:space="preserve"> </w:t>
@@ -463,19 +475,25 @@
         <w:t xml:space="preserve"> </w:t>
       </w:r>
       <w:r>
-        <w:t xml:space="preserve">tenderness without peritoneal signs; digital rectal examination was</w:t>
-      </w:r>
-      <w:r>
-        <w:t xml:space="preserve"> </w:t>
-      </w:r>
-      <w:r>
-        <w:t xml:space="preserve">deferred on clinical grounds, as cross-sectional imaging was considered</w:t>
-      </w:r>
-      <w:r>
-        <w:t xml:space="preserve"> </w:t>
-      </w:r>
-      <w:r>
-        <w:t xml:space="preserve">sufficient to characterise the pelvic mass and guide further workup. Laboratory investigations showed leukocytosis (WBC 12,310/μL)</w:t>
+        <w:t xml:space="preserve">tenderness without peritoneal signs. Digital rectal examination on</w:t>
+      </w:r>
+      <w:r>
+        <w:t xml:space="preserve"> </w:t>
+      </w:r>
+      <w:r>
+        <w:t xml:space="preserve">hospital day two identified a large, firm mass at the 2 o’clock position</w:t>
+      </w:r>
+      <w:r>
+        <w:t xml:space="preserve"> </w:t>
+      </w:r>
+      <w:r>
+        <w:t xml:space="preserve">of the left lateral rectal wall, palpable approximately 4 cm from the</w:t>
+      </w:r>
+      <w:r>
+        <w:t xml:space="preserve"> </w:t>
+      </w:r>
+      <w:r>
+        <w:t xml:space="preserve">anal verge. Laboratory investigations showed leukocytosis (WBC 12,310/μL)</w:t>
       </w:r>
       <w:r>
         <w:t xml:space="preserve"> </w:t>
@@ -587,19 +605,19 @@
         <w:t xml:space="preserve"> </w:t>
       </w:r>
       <w:r>
-        <w:t xml:space="preserve">AFP-producing tumors. Third, review of the CECT confirmed the absence of</w:t>
-      </w:r>
-      <w:r>
-        <w:t xml:space="preserve"> </w:t>
-      </w:r>
-      <w:r>
-        <w:t xml:space="preserve">enhancement within the mass — a feature inconsistent with</w:t>
-      </w:r>
-      <w:r>
-        <w:t xml:space="preserve"> </w:t>
-      </w:r>
-      <w:r>
-        <w:t xml:space="preserve">hypervascular GIST or enhancing lymphoma.</w:t>
+        <w:t xml:space="preserve">AFP-producing tumors. Third, retrospective review of the CECT by the treating surgical team</w:t>
+      </w:r>
+      <w:r>
+        <w:t xml:space="preserve"> </w:t>
+      </w:r>
+      <w:r>
+        <w:t xml:space="preserve">confirmed the absence of internal enhancement within the mass — a</w:t>
+      </w:r>
+      <w:r>
+        <w:t xml:space="preserve"> </w:t>
+      </w:r>
+      <w:r>
+        <w:t xml:space="preserve">feature inconsistent with hypervascular GIST or enhancing lymphoma.</w:t>
       </w:r>
     </w:p>
     <w:p>
@@ -619,19 +637,19 @@
         <w:t xml:space="preserve"> </w:t>
       </w:r>
       <w:r>
-        <w:t xml:space="preserve">guide surgical decision-making. Pre-operative workup additionally</w:t>
-      </w:r>
-      <w:r>
-        <w:t xml:space="preserve"> </w:t>
-      </w:r>
-      <w:r>
-        <w:t xml:space="preserve">revealed left hydronephrosis from ureteral compression; cardiac and</w:t>
-      </w:r>
-      <w:r>
-        <w:t xml:space="preserve"> </w:t>
-      </w:r>
-      <w:r>
-        <w:t xml:space="preserve">pulmonary evaluation confirmed low surgical risk.</w:t>
+        <w:t xml:space="preserve">guide surgical decision-making. The mass’s proximity to the left ureter raised concern for</w:t>
+      </w:r>
+      <w:r>
+        <w:t xml:space="preserve"> </w:t>
+      </w:r>
+      <w:r>
+        <w:t xml:space="preserve">intraoperative ureteral injury; cardiac and pulmonary evaluation</w:t>
+      </w:r>
+      <w:r>
+        <w:t xml:space="preserve"> </w:t>
+      </w:r>
+      <w:r>
+        <w:t xml:space="preserve">confirmed low surgical risk.</w:t>
       </w:r>
     </w:p>
     <w:p>
@@ -663,37 +681,31 @@
         <w:t xml:space="preserve"> </w:t>
       </w:r>
       <w:r>
-        <w:t xml:space="preserve">pelvic floor mass with left hydronephrosis. The cyst was intentionally</w:t>
-      </w:r>
-      <w:r>
-        <w:t xml:space="preserve"> </w:t>
-      </w:r>
-      <w:r>
-        <w:t xml:space="preserve">decompressed by aspiration of its contents to facilitate dissection,</w:t>
-      </w:r>
-      <w:r>
-        <w:t xml:space="preserve"> </w:t>
-      </w:r>
-      <w:r>
-        <w:t xml:space="preserve">after which the cyst wall was completely excised with the fibrous</w:t>
-      </w:r>
-      <w:r>
-        <w:t xml:space="preserve"> </w:t>
-      </w:r>
-      <w:r>
-        <w:t xml:space="preserve">capsule intact. No inadvertent rupture or intraperitoneal spillage</w:t>
-      </w:r>
-      <w:r>
-        <w:t xml:space="preserve"> </w:t>
-      </w:r>
-      <w:r>
-        <w:t xml:space="preserve">occurred. Complete excision of the cyst wall was achieved; estimated</w:t>
-      </w:r>
-      <w:r>
-        <w:t xml:space="preserve"> </w:t>
-      </w:r>
-      <w:r>
-        <w:t xml:space="preserve">blood loss was minimal. Post-operative recovery was uneventful: flatus was noted on day 3,</w:t>
+        <w:t xml:space="preserve">pelvic floor mass with Grade 3 left hydronephrosis (Society of Fetal Urology</w:t>
+      </w:r>
+      <w:r>
+        <w:t xml:space="preserve"> </w:t>
+      </w:r>
+      <w:r>
+        <w:t xml:space="preserve">grading). The cyst was intentionally decompressed by aspiration to facilitate</w:t>
+      </w:r>
+      <w:r>
+        <w:t xml:space="preserve"> </w:t>
+      </w:r>
+      <w:r>
+        <w:t xml:space="preserve">dissection; the cyst wall and fibrous capsule were then completely</w:t>
+      </w:r>
+      <w:r>
+        <w:t xml:space="preserve"> </w:t>
+      </w:r>
+      <w:r>
+        <w:t xml:space="preserve">excised without inadvertent rupture or intraperitoneal spillage.</w:t>
+      </w:r>
+      <w:r>
+        <w:t xml:space="preserve"> </w:t>
+      </w:r>
+      <w:r>
+        <w:t xml:space="preserve">Estimated blood loss was minimal. Post-operative recovery was uneventful: flatus was noted on day 3,</w:t>
       </w:r>
       <w:r>
         <w:t xml:space="preserve"> </w:t>
@@ -711,13 +723,43 @@
         <w:t xml:space="preserve"> </w:t>
       </w:r>
       <w:r>
-        <w:t xml:space="preserve">The patient was discharged on post-operative day 9 with a clean, dry</w:t>
-      </w:r>
-      <w:r>
-        <w:t xml:space="preserve"> </w:t>
-      </w:r>
-      <w:r>
-        <w:t xml:space="preserve">wound, and outpatient follow-up was arranged.</w:t>
+        <w:t xml:space="preserve">Renal function remained stable post-operatively (serum creatinine</w:t>
+      </w:r>
+      <w:r>
+        <w:t xml:space="preserve"> </w:t>
+      </w:r>
+      <w:r>
+        <w:t xml:space="preserve">0.85 mg/dL; eGFR 99 mL/min/1.73 m²) with no clinical or biochemical</w:t>
+      </w:r>
+      <w:r>
+        <w:t xml:space="preserve"> </w:t>
+      </w:r>
+      <w:r>
+        <w:t xml:space="preserve">evidence of persistent hydronephrosis at discharge. The Double-J</w:t>
+      </w:r>
+      <w:r>
+        <w:t xml:space="preserve"> </w:t>
+      </w:r>
+      <w:r>
+        <w:t xml:space="preserve">ureteral stent was retained in situ, with outpatient removal planned.</w:t>
+      </w:r>
+      <w:r>
+        <w:t xml:space="preserve"> </w:t>
+      </w:r>
+      <w:r>
+        <w:t xml:space="preserve">Tumour marker surveillance (CEA, CA19-9) with complete blood count and</w:t>
+      </w:r>
+      <w:r>
+        <w:t xml:space="preserve"> </w:t>
+      </w:r>
+      <w:r>
+        <w:t xml:space="preserve">biochemistry was scheduled at six months. The patient was discharged on</w:t>
+      </w:r>
+      <w:r>
+        <w:t xml:space="preserve"> </w:t>
+      </w:r>
+      <w:r>
+        <w:t xml:space="preserve">post-operative day 9 with a clean, dry wound.</w:t>
       </w:r>
     </w:p>
     <w:p>
@@ -755,7 +797,13 @@
         <w:t xml:space="preserve"> </w:t>
       </w:r>
       <w:r>
-        <w:t xml:space="preserve">pathological diagnosis was epidermoid cyst.</w:t>
+        <w:t xml:space="preserve">pathological diagnosis was epidermoid cyst. The clinical timeline is</w:t>
+      </w:r>
+      <w:r>
+        <w:t xml:space="preserve"> </w:t>
+      </w:r>
+      <w:r>
+        <w:t xml:space="preserve">summarised in Table 1.</w:t>
       </w:r>
     </w:p>
     <w:p>
@@ -820,91 +868,115 @@
         <w:t xml:space="preserve"> </w:t>
       </w:r>
       <w:r>
-        <w:t xml:space="preserve">colonoscopy was negative for any mucosal lesion, confirming that the</w:t>
-      </w:r>
-      <w:r>
-        <w:t xml:space="preserve"> </w:t>
-      </w:r>
-      <w:r>
-        <w:t xml:space="preserve">mass was extrinsic to the rectum rather than a primary intraluminal</w:t>
-      </w:r>
-      <w:r>
-        <w:t xml:space="preserve"> </w:t>
-      </w:r>
-      <w:r>
-        <w:t xml:space="preserve">neoplasm. Large epidermoid cysts in the pararectal or pelvic floor space</w:t>
-      </w:r>
-      <w:r>
-        <w:t xml:space="preserve"> </w:t>
-      </w:r>
-      <w:r>
-        <w:t xml:space="preserve">can compress the rectal wall to create a CT appearance of a submucosal</w:t>
-      </w:r>
-      <w:r>
-        <w:t xml:space="preserve"> </w:t>
-      </w:r>
-      <w:r>
-        <w:t xml:space="preserve">mass, as has been described previously (Kesavan et al., 2019). Second,</w:t>
-      </w:r>
-      <w:r>
-        <w:t xml:space="preserve"> </w:t>
-      </w:r>
-      <w:r>
-        <w:t xml:space="preserve">normal tumor markers (CEA, AFP, CA19-9) substantially reduced the</w:t>
-      </w:r>
-      <w:r>
-        <w:t xml:space="preserve"> </w:t>
-      </w:r>
-      <w:r>
-        <w:t xml:space="preserve">probability of common GI malignancies. Third, the absence of enhancement</w:t>
-      </w:r>
-      <w:r>
-        <w:t xml:space="preserve"> </w:t>
-      </w:r>
-      <w:r>
-        <w:t xml:space="preserve">on CECT argued against both GIST — which characteristically</w:t>
-      </w:r>
-      <w:r>
-        <w:t xml:space="preserve"> </w:t>
-      </w:r>
-      <w:r>
-        <w:t xml:space="preserve">demonstrates avid homogeneous enhancement — and lymphoma, which shows</w:t>
-      </w:r>
-      <w:r>
-        <w:t xml:space="preserve"> </w:t>
-      </w:r>
-      <w:r>
-        <w:t xml:space="preserve">mild to moderate enhancement (Bates et al., 2019). Individually, none</w:t>
-      </w:r>
-      <w:r>
-        <w:t xml:space="preserve"> </w:t>
-      </w:r>
-      <w:r>
-        <w:t xml:space="preserve">of these findings is specific for epidermoid cyst; together, however,</w:t>
-      </w:r>
-      <w:r>
-        <w:t xml:space="preserve"> </w:t>
-      </w:r>
-      <w:r>
-        <w:t xml:space="preserve">they are consistent with a benign non-enhancing extrinsic cystic pelvic</w:t>
-      </w:r>
-      <w:r>
-        <w:t xml:space="preserve"> </w:t>
-      </w:r>
-      <w:r>
-        <w:t xml:space="preserve">mass, and their combination should prompt surgical excision for</w:t>
-      </w:r>
-      <w:r>
-        <w:t xml:space="preserve"> </w:t>
-      </w:r>
-      <w:r>
-        <w:t xml:space="preserve">histopathological confirmation, with epidermoid cyst included in the</w:t>
-      </w:r>
-      <w:r>
-        <w:t xml:space="preserve"> </w:t>
-      </w:r>
-      <w:r>
-        <w:t xml:space="preserve">differential diagnosis.</w:t>
+        <w:t xml:space="preserve">colonoscopy was negative for any mucosal lesion, confirming the mass was</w:t>
+      </w:r>
+      <w:r>
+        <w:t xml:space="preserve"> </w:t>
+      </w:r>
+      <w:r>
+        <w:t xml:space="preserve">extrinsic to the rectum rather than an intraluminal neoplasm; large</w:t>
+      </w:r>
+      <w:r>
+        <w:t xml:space="preserve"> </w:t>
+      </w:r>
+      <w:r>
+        <w:t xml:space="preserve">epidermoid cysts can compress the rectal wall to create a CT appearance</w:t>
+      </w:r>
+      <w:r>
+        <w:t xml:space="preserve"> </w:t>
+      </w:r>
+      <w:r>
+        <w:t xml:space="preserve">of a submucosal mass.</w:t>
+      </w:r>
+      <w:r>
+        <w:rPr>
+          <w:vertAlign w:val="superscript"/>
+        </w:rPr>
+        <w:t xml:space="preserve">6</w:t>
+      </w:r>
+      <w:r>
+        <w:t xml:space="preserve"> </w:t>
+      </w:r>
+      <w:r>
+        <w:t xml:space="preserve">Second, normal tumor</w:t>
+      </w:r>
+      <w:r>
+        <w:t xml:space="preserve"> </w:t>
+      </w:r>
+      <w:r>
+        <w:t xml:space="preserve">markers (CEA, AFP, CA19-9) substantially reduced the probability of</w:t>
+      </w:r>
+      <w:r>
+        <w:t xml:space="preserve"> </w:t>
+      </w:r>
+      <w:r>
+        <w:t xml:space="preserve">common GI malignancies. Third, the absence of internal enhancement on</w:t>
+      </w:r>
+      <w:r>
+        <w:t xml:space="preserve"> </w:t>
+      </w:r>
+      <w:r>
+        <w:t xml:space="preserve">CECT argued against hypervascular GIST and enhancing lymphoma.</w:t>
+      </w:r>
+      <w:r>
+        <w:rPr>
+          <w:vertAlign w:val="superscript"/>
+        </w:rPr>
+        <w:t xml:space="preserve">5</w:t>
+      </w:r>
+      <w:r>
+        <w:t xml:space="preserve"> </w:t>
+      </w:r>
+      <w:r>
+        <w:t xml:space="preserve">Individually, none of these findings is specific for</w:t>
+      </w:r>
+      <w:r>
+        <w:t xml:space="preserve"> </w:t>
+      </w:r>
+      <w:r>
+        <w:t xml:space="preserve">epidermoid cyst; together, they point toward a benign non-enhancing</w:t>
+      </w:r>
+      <w:r>
+        <w:t xml:space="preserve"> </w:t>
+      </w:r>
+      <w:r>
+        <w:t xml:space="preserve">extrinsic cystic mass. Despite the DRE identifying a large firm mass —</w:t>
+      </w:r>
+      <w:r>
+        <w:t xml:space="preserve"> </w:t>
+      </w:r>
+      <w:r>
+        <w:t xml:space="preserve">a finding that initially heightened malignancy concern — the clinical</w:t>
+      </w:r>
+      <w:r>
+        <w:t xml:space="preserve"> </w:t>
+      </w:r>
+      <w:r>
+        <w:t xml:space="preserve">team elected direct surgical excision rather than pre-operative tissue</w:t>
+      </w:r>
+      <w:r>
+        <w:t xml:space="preserve"> </w:t>
+      </w:r>
+      <w:r>
+        <w:t xml:space="preserve">biopsy, judging that the non-enhancing cystic morphology was</w:t>
+      </w:r>
+      <w:r>
+        <w:t xml:space="preserve"> </w:t>
+      </w:r>
+      <w:r>
+        <w:t xml:space="preserve">inconsistent with the solid tumours in the differential and that</w:t>
+      </w:r>
+      <w:r>
+        <w:t xml:space="preserve"> </w:t>
+      </w:r>
+      <w:r>
+        <w:t xml:space="preserve">complete excision would serve as both the definitive diagnostic and</w:t>
+      </w:r>
+      <w:r>
+        <w:t xml:space="preserve"> </w:t>
+      </w:r>
+      <w:r>
+        <w:t xml:space="preserve">therapeutic step.</w:t>
       </w:r>
     </w:p>
     <w:p>
@@ -912,79 +984,91 @@
         <w:pStyle w:val="BodyText"/>
       </w:pPr>
       <w:r>
-        <w:t xml:space="preserve">CT misidentification and the "metastatic lymphadenopathy" red herring.</w:t>
-      </w:r>
-      <w:r>
-        <w:t xml:space="preserve"> </w:t>
-      </w:r>
-      <w:r>
-        <w:t xml:space="preserve">The initial CT report described "metastatic LAP of the right internal</w:t>
-      </w:r>
-      <w:r>
-        <w:t xml:space="preserve"> </w:t>
-      </w:r>
-      <w:r>
-        <w:t xml:space="preserve">iliac region," which substantially raised concern for a malignant</w:t>
-      </w:r>
-      <w:r>
-        <w:t xml:space="preserve"> </w:t>
-      </w:r>
-      <w:r>
-        <w:t xml:space="preserve">process. In retrospect, regional lymphadenopathy adjacent to a large</w:t>
-      </w:r>
-      <w:r>
-        <w:t xml:space="preserve"> </w:t>
-      </w:r>
-      <w:r>
-        <w:t xml:space="preserve">benign cystic mass may reflect reactive inflammation secondary to cyst</w:t>
-      </w:r>
-      <w:r>
-        <w:t xml:space="preserve"> </w:t>
-      </w:r>
-      <w:r>
-        <w:t xml:space="preserve">contents or simple mechanical compression rather than true metastatic</w:t>
-      </w:r>
-      <w:r>
-        <w:t xml:space="preserve"> </w:t>
-      </w:r>
-      <w:r>
-        <w:t xml:space="preserve">disease. This interpretation is consistent with the uniformly normal</w:t>
-      </w:r>
-      <w:r>
-        <w:t xml:space="preserve"> </w:t>
-      </w:r>
-      <w:r>
-        <w:t xml:space="preserve">tumor markers and the pathological absence of malignancy. Clinicians should exercise caution in attributing lymphadenopathy to</w:t>
-      </w:r>
-      <w:r>
-        <w:t xml:space="preserve"> </w:t>
-      </w:r>
-      <w:r>
-        <w:t xml:space="preserve">metastatic disease in the absence of a confirmed primary malignancy. It</w:t>
-      </w:r>
-      <w:r>
-        <w:t xml:space="preserve"> </w:t>
-      </w:r>
-      <w:r>
-        <w:t xml:space="preserve">should be acknowledged as a limitation of this case that neither lymph</w:t>
-      </w:r>
-      <w:r>
-        <w:t xml:space="preserve"> </w:t>
-      </w:r>
-      <w:r>
-        <w:t xml:space="preserve">node biopsy nor post-operative imaging was performed to confirm</w:t>
-      </w:r>
-      <w:r>
-        <w:t xml:space="preserve"> </w:t>
-      </w:r>
-      <w:r>
-        <w:t xml:space="preserve">resolution of the lymphadenopathy; the reactive interpretation therefore</w:t>
-      </w:r>
-      <w:r>
-        <w:t xml:space="preserve"> </w:t>
-      </w:r>
-      <w:r>
-        <w:t xml:space="preserve">remains inferential.</w:t>
+        <w:t xml:space="preserve">CT misidentification and the</w:t>
+      </w:r>
+      <w:r>
+        <w:t xml:space="preserve"> </w:t>
+      </w:r>
+      <w:r>
+        <w:t xml:space="preserve">“metastatic lymphadenopathy”</w:t>
+      </w:r>
+      <w:r>
+        <w:t xml:space="preserve"> </w:t>
+      </w:r>
+      <w:r>
+        <w:t xml:space="preserve">red herring.</w:t>
+      </w:r>
+      <w:r>
+        <w:t xml:space="preserve"> </w:t>
+      </w:r>
+      <w:r>
+        <w:t xml:space="preserve">The initial CT report described</w:t>
+      </w:r>
+      <w:r>
+        <w:t xml:space="preserve"> </w:t>
+      </w:r>
+      <w:r>
+        <w:t xml:space="preserve">“metastatic LAP of the right internal</w:t>
+      </w:r>
+      <w:r>
+        <w:t xml:space="preserve"> </w:t>
+      </w:r>
+      <w:r>
+        <w:t xml:space="preserve">iliac region,”</w:t>
+      </w:r>
+      <w:r>
+        <w:t xml:space="preserve"> </w:t>
+      </w:r>
+      <w:r>
+        <w:t xml:space="preserve">substantially raising concern for malignancy. In</w:t>
+      </w:r>
+      <w:r>
+        <w:t xml:space="preserve"> </w:t>
+      </w:r>
+      <w:r>
+        <w:t xml:space="preserve">retrospect, regional lymphadenopathy adjacent to a large benign cystic</w:t>
+      </w:r>
+      <w:r>
+        <w:t xml:space="preserve"> </w:t>
+      </w:r>
+      <w:r>
+        <w:t xml:space="preserve">mass may reflect reactive inflammation or mechanical compression rather</w:t>
+      </w:r>
+      <w:r>
+        <w:t xml:space="preserve"> </w:t>
+      </w:r>
+      <w:r>
+        <w:t xml:space="preserve">than true metastasis — an interpretation consistent with uniformly</w:t>
+      </w:r>
+      <w:r>
+        <w:t xml:space="preserve"> </w:t>
+      </w:r>
+      <w:r>
+        <w:t xml:space="preserve">normal tumor markers and pathological absence of malignancy. As neither</w:t>
+      </w:r>
+      <w:r>
+        <w:t xml:space="preserve"> </w:t>
+      </w:r>
+      <w:r>
+        <w:t xml:space="preserve">nodal biopsy nor post-operative imaging was performed, the reactive</w:t>
+      </w:r>
+      <w:r>
+        <w:t xml:space="preserve"> </w:t>
+      </w:r>
+      <w:r>
+        <w:t xml:space="preserve">interpretation remains inferential; clinicians should exercise caution</w:t>
+      </w:r>
+      <w:r>
+        <w:t xml:space="preserve"> </w:t>
+      </w:r>
+      <w:r>
+        <w:t xml:space="preserve">in attributing lymphadenopathy to metastatic disease without a confirmed</w:t>
+      </w:r>
+      <w:r>
+        <w:t xml:space="preserve"> </w:t>
+      </w:r>
+      <w:r>
+        <w:t xml:space="preserve">primary.</w:t>
       </w:r>
     </w:p>
     <w:p>
@@ -992,55 +1076,43 @@
         <w:pStyle w:val="BodyText"/>
       </w:pPr>
       <w:r>
-        <w:t xml:space="preserve">Pathogenesis. In this 61-year-old male with no prior abdominal surgery,</w:t>
-      </w:r>
-      <w:r>
-        <w:t xml:space="preserve"> </w:t>
-      </w:r>
-      <w:r>
-        <w:t xml:space="preserve">embryological sequestration is the most plausible mechanism. During</w:t>
-      </w:r>
-      <w:r>
-        <w:t xml:space="preserve"> </w:t>
-      </w:r>
-      <w:r>
-        <w:t xml:space="preserve">embryological development, ectodermal cells may become sequestered in</w:t>
-      </w:r>
-      <w:r>
-        <w:t xml:space="preserve"> </w:t>
-      </w:r>
-      <w:r>
-        <w:t xml:space="preserve">the pelvic mesenchyme, progressively accumulating keratin and</w:t>
-      </w:r>
-      <w:r>
-        <w:t xml:space="preserve"> </w:t>
-      </w:r>
-      <w:r>
-        <w:t xml:space="preserve">desquamated epithelium over decades until the lesion attains symptomatic</w:t>
-      </w:r>
-      <w:r>
-        <w:t xml:space="preserve"> </w:t>
-      </w:r>
-      <w:r>
-        <w:t xml:space="preserve">size (Hyseni et al., 2009; Fdili Alaoui et al., 2012). The prolonged</w:t>
-      </w:r>
-      <w:r>
-        <w:t xml:space="preserve"> </w:t>
-      </w:r>
-      <w:r>
-        <w:t xml:space="preserve">symptomatic history of two months for bowel symptoms, and potentially a</w:t>
-      </w:r>
-      <w:r>
-        <w:t xml:space="preserve"> </w:t>
-      </w:r>
-      <w:r>
-        <w:t xml:space="preserve">much longer subclinical course before that, is consistent with this</w:t>
-      </w:r>
-      <w:r>
-        <w:t xml:space="preserve"> </w:t>
-      </w:r>
-      <w:r>
-        <w:t xml:space="preserve">slow-growth model.</w:t>
+        <w:t xml:space="preserve">Pathogenesis. In this patient with no prior abdominal surgery,</w:t>
+      </w:r>
+      <w:r>
+        <w:t xml:space="preserve"> </w:t>
+      </w:r>
+      <w:r>
+        <w:t xml:space="preserve">embryological sequestration of ectodermal cells within the pelvic</w:t>
+      </w:r>
+      <w:r>
+        <w:t xml:space="preserve"> </w:t>
+      </w:r>
+      <w:r>
+        <w:t xml:space="preserve">mesenchyme is the most plausible mechanism, with keratin accumulating</w:t>
+      </w:r>
+      <w:r>
+        <w:t xml:space="preserve"> </w:t>
+      </w:r>
+      <w:r>
+        <w:t xml:space="preserve">over decades until the lesion becomes symptomatic.</w:t>
+      </w:r>
+      <w:r>
+        <w:rPr>
+          <w:vertAlign w:val="superscript"/>
+        </w:rPr>
+        <w:t xml:space="preserve">1,4</w:t>
+      </w:r>
+      <w:r>
+        <w:t xml:space="preserve"> </w:t>
+      </w:r>
+      <w:r>
+        <w:t xml:space="preserve">The two-month symptomatic history likely</w:t>
+      </w:r>
+      <w:r>
+        <w:t xml:space="preserve"> </w:t>
+      </w:r>
+      <w:r>
+        <w:t xml:space="preserve">represents the terminal phase of a much longer subclinical course.</w:t>
       </w:r>
     </w:p>
     <w:p>
@@ -1054,31 +1126,31 @@
         <w:t xml:space="preserve"> </w:t>
       </w:r>
       <w:r>
-        <w:t xml:space="preserve">the present case: extrinsic rectal compression, ureteral obstruction,</w:t>
-      </w:r>
-      <w:r>
-        <w:t xml:space="preserve"> </w:t>
-      </w:r>
-      <w:r>
-        <w:t xml:space="preserve">and mass size exceeding 10 cm (Fdili Alaoui et al., 2012; AlSulimani</w:t>
-      </w:r>
-      <w:r>
-        <w:t xml:space="preserve"> </w:t>
-      </w:r>
-      <w:r>
-        <w:t xml:space="preserve">et al., 2023). The present case is notable for the patient’s older age</w:t>
-      </w:r>
-      <w:r>
-        <w:t xml:space="preserve"> </w:t>
-      </w:r>
-      <w:r>
-        <w:t xml:space="preserve">and the unusually compelling CT mimicry, including apparent</w:t>
-      </w:r>
-      <w:r>
-        <w:t xml:space="preserve"> </w:t>
-      </w:r>
-      <w:r>
-        <w:t xml:space="preserve">lymphadenopathy, which is not prominently described in prior reports.</w:t>
+        <w:t xml:space="preserve">the present case — extrinsic rectal compression, ureteral obstruction,</w:t>
+      </w:r>
+      <w:r>
+        <w:t xml:space="preserve"> </w:t>
+      </w:r>
+      <w:r>
+        <w:t xml:space="preserve">and mass size exceeding 10 cm.</w:t>
+      </w:r>
+      <w:r>
+        <w:rPr>
+          <w:vertAlign w:val="superscript"/>
+        </w:rPr>
+        <w:t xml:space="preserve">1,7</w:t>
+      </w:r>
+      <w:r>
+        <w:t xml:space="preserve"> </w:t>
+      </w:r>
+      <w:r>
+        <w:t xml:space="preserve">The compelling CT mimicry, including apparent</w:t>
+      </w:r>
+      <w:r>
+        <w:t xml:space="preserve"> </w:t>
+      </w:r>
+      <w:r>
+        <w:t xml:space="preserve">lymphadenopathy, is not prominently described in prior reports.</w:t>
       </w:r>
     </w:p>
     <w:p>
@@ -1086,43 +1158,43 @@
         <w:pStyle w:val="BodyText"/>
       </w:pPr>
       <w:r>
-        <w:t xml:space="preserve">Management of concurrent hydronephrosis. The combination of a large</w:t>
-      </w:r>
-      <w:r>
-        <w:t xml:space="preserve"> </w:t>
-      </w:r>
-      <w:r>
-        <w:t xml:space="preserve">pelvic cyst with ureteral obstruction warrants pre-operative or</w:t>
-      </w:r>
-      <w:r>
-        <w:t xml:space="preserve"> </w:t>
-      </w:r>
-      <w:r>
-        <w:t xml:space="preserve">concurrent ureteral stenting. In the present case, a Double-J stent was</w:t>
-      </w:r>
-      <w:r>
-        <w:t xml:space="preserve"> </w:t>
-      </w:r>
-      <w:r>
-        <w:t xml:space="preserve">placed cystoscopically under the same anaesthetic, allowing safe</w:t>
-      </w:r>
-      <w:r>
-        <w:t xml:space="preserve"> </w:t>
-      </w:r>
-      <w:r>
-        <w:t xml:space="preserve">dissection of the pelvic mass without risk of ureteral injury. This</w:t>
-      </w:r>
-      <w:r>
-        <w:t xml:space="preserve"> </w:t>
-      </w:r>
-      <w:r>
-        <w:t xml:space="preserve">approach aligns with the management of similar cases where ureteral</w:t>
-      </w:r>
-      <w:r>
-        <w:t xml:space="preserve"> </w:t>
-      </w:r>
-      <w:r>
-        <w:t xml:space="preserve">involvement has been reported (Fdili Alaoui et al., 2012).</w:t>
+        <w:t xml:space="preserve">Management of ureteral compression risk. A large pelvic cyst with</w:t>
+      </w:r>
+      <w:r>
+        <w:t xml:space="preserve"> </w:t>
+      </w:r>
+      <w:r>
+        <w:t xml:space="preserve">ureteral compression risk warrants prophylactic pre-operative or</w:t>
+      </w:r>
+      <w:r>
+        <w:t xml:space="preserve"> </w:t>
+      </w:r>
+      <w:r>
+        <w:t xml:space="preserve">concurrent ureteral stenting. In the present case, a Double-J stent</w:t>
+      </w:r>
+      <w:r>
+        <w:t xml:space="preserve"> </w:t>
+      </w:r>
+      <w:r>
+        <w:t xml:space="preserve">placed cystoscopically under the same anaesthetic allowed safe</w:t>
+      </w:r>
+      <w:r>
+        <w:t xml:space="preserve"> </w:t>
+      </w:r>
+      <w:r>
+        <w:t xml:space="preserve">dissection without ureteral injury — an approach consistent with prior</w:t>
+      </w:r>
+      <w:r>
+        <w:t xml:space="preserve"> </w:t>
+      </w:r>
+      <w:r>
+        <w:t xml:space="preserve">reports.</w:t>
+      </w:r>
+      <w:r>
+        <w:rPr>
+          <w:vertAlign w:val="superscript"/>
+        </w:rPr>
+        <w:t xml:space="preserve">1</w:t>
       </w:r>
     </w:p>
     <w:p>
@@ -1148,7 +1220,19 @@
         <w:t xml:space="preserve"> </w:t>
       </w:r>
       <w:r>
-        <w:t xml:space="preserve">recurrence (Koppel &amp; Weinberger, 1987). In the index case, the cyst was intentionally decompressed prior to</w:t>
+        <w:t xml:space="preserve">recurrence.</w:t>
+      </w:r>
+      <w:r>
+        <w:rPr>
+          <w:vertAlign w:val="superscript"/>
+        </w:rPr>
+        <w:t xml:space="preserve">8</w:t>
+      </w:r>
+      <w:r>
+        <w:t xml:space="preserve"> </w:t>
+      </w:r>
+      <w:r>
+        <w:t xml:space="preserve">In the index case, the cyst was intentionally decompressed prior to</w:t>
       </w:r>
       <w:r>
         <w:t xml:space="preserve"> </w:t>
@@ -1178,7 +1262,19 @@
         <w:t xml:space="preserve"> </w:t>
       </w:r>
       <w:r>
-        <w:t xml:space="preserve">literature (Nasim et al., 2020). Malignant transformation to squamous</w:t>
+        <w:t xml:space="preserve">literature.</w:t>
+      </w:r>
+      <w:r>
+        <w:rPr>
+          <w:vertAlign w:val="superscript"/>
+        </w:rPr>
+        <w:t xml:space="preserve">3</w:t>
+      </w:r>
+      <w:r>
+        <w:t xml:space="preserve"> </w:t>
+      </w:r>
+      <w:r>
+        <w:t xml:space="preserve">Malignant transformation to squamous</w:t>
       </w:r>
       <w:r>
         <w:t xml:space="preserve"> </w:t>
@@ -1202,7 +1298,13 @@
         <w:t xml:space="preserve"> </w:t>
       </w:r>
       <w:r>
-        <w:t xml:space="preserve">long-term follow-up (Hu et al., 2022).</w:t>
+        <w:t xml:space="preserve">long-term follow-up.</w:t>
+      </w:r>
+      <w:r>
+        <w:rPr>
+          <w:vertAlign w:val="superscript"/>
+        </w:rPr>
+        <w:t xml:space="preserve">9</w:t>
       </w:r>
     </w:p>
     <w:p>
@@ -1234,31 +1336,49 @@
         <w:t xml:space="preserve"> </w:t>
       </w:r>
       <w:r>
-        <w:t xml:space="preserve">not. The absence of adnexal structures in the present case confirms the</w:t>
-      </w:r>
-      <w:r>
-        <w:t xml:space="preserve"> </w:t>
-      </w:r>
-      <w:r>
-        <w:t xml:space="preserve">diagnosis of epidermoid cyst. Mesothelioma — which appeared in the</w:t>
-      </w:r>
-      <w:r>
-        <w:t xml:space="preserve"> </w:t>
-      </w:r>
-      <w:r>
-        <w:t xml:space="preserve">discharge differential — is excluded by the squamous epithelial</w:t>
-      </w:r>
-      <w:r>
-        <w:t xml:space="preserve"> </w:t>
-      </w:r>
-      <w:r>
-        <w:t xml:space="preserve">lining; mesothelioma is characterized by a mesothelial cell lining</w:t>
-      </w:r>
-      <w:r>
-        <w:t xml:space="preserve"> </w:t>
-      </w:r>
-      <w:r>
-        <w:t xml:space="preserve">positive for calretinin and WT-1 on immunohistochemistry.</w:t>
+        <w:t xml:space="preserve">not. Retrorectal tailgut cyst — another non-enhancing extrinsic pelvic</w:t>
+      </w:r>
+      <w:r>
+        <w:t xml:space="preserve"> </w:t>
+      </w:r>
+      <w:r>
+        <w:t xml:space="preserve">cyst that satisfies the same diagnostic triad — is lined by columnar or</w:t>
+      </w:r>
+      <w:r>
+        <w:t xml:space="preserve"> </w:t>
+      </w:r>
+      <w:r>
+        <w:t xml:space="preserve">transitional epithelium rather than keratinized squamous epithelium; the</w:t>
+      </w:r>
+      <w:r>
+        <w:t xml:space="preserve"> </w:t>
+      </w:r>
+      <w:r>
+        <w:t xml:space="preserve">squamous lining in the present case excludes this entity. The absence of</w:t>
+      </w:r>
+      <w:r>
+        <w:t xml:space="preserve"> </w:t>
+      </w:r>
+      <w:r>
+        <w:t xml:space="preserve">adnexal structures confirms the diagnosis of epidermoid cyst over</w:t>
+      </w:r>
+      <w:r>
+        <w:t xml:space="preserve"> </w:t>
+      </w:r>
+      <w:r>
+        <w:t xml:space="preserve">dermoid cyst. Mesothelioma is excluded by the squamous epithelial</w:t>
+      </w:r>
+      <w:r>
+        <w:t xml:space="preserve"> </w:t>
+      </w:r>
+      <w:r>
+        <w:t xml:space="preserve">lining; mesothelioma demonstrates a mesothelial lining positive for</w:t>
+      </w:r>
+      <w:r>
+        <w:t xml:space="preserve"> </w:t>
+      </w:r>
+      <w:r>
+        <w:t xml:space="preserve">calretinin and WT-1 on immunohistochemistry.</w:t>
       </w:r>
     </w:p>
     <w:p>
@@ -1266,31 +1386,43 @@
         <w:pStyle w:val="BodyText"/>
       </w:pPr>
       <w:r>
-        <w:t xml:space="preserve">Limitations. CT Hounsfield unit values were not extracted from the</w:t>
-      </w:r>
-      <w:r>
-        <w:t xml:space="preserve"> </w:t>
-      </w:r>
-      <w:r>
-        <w:t xml:space="preserve">original report, hydronephrosis was not formally graded, and</w:t>
-      </w:r>
-      <w:r>
-        <w:t xml:space="preserve"> </w:t>
-      </w:r>
-      <w:r>
-        <w:t xml:space="preserve">post-operative urological follow-up data were unavailable. The reactive</w:t>
-      </w:r>
-      <w:r>
-        <w:t xml:space="preserve"> </w:t>
-      </w:r>
-      <w:r>
-        <w:t xml:space="preserve">interpretation of regional lymphadenopathy remains inferential, as no</w:t>
-      </w:r>
-      <w:r>
-        <w:t xml:space="preserve"> </w:t>
-      </w:r>
-      <w:r>
-        <w:t xml:space="preserve">post-operative imaging or nodal biopsy was performed.</w:t>
+        <w:t xml:space="preserve">Limitations. CT Hounsfield unit values were not extracted.</w:t>
+      </w:r>
+      <w:r>
+        <w:t xml:space="preserve"> </w:t>
+      </w:r>
+      <w:r>
+        <w:t xml:space="preserve">Pre-operative tissue sampling was not performed; the decision to proceed</w:t>
+      </w:r>
+      <w:r>
+        <w:t xml:space="preserve"> </w:t>
+      </w:r>
+      <w:r>
+        <w:t xml:space="preserve">directly to laparotomy was based on the non-enhancing cystic morphology</w:t>
+      </w:r>
+      <w:r>
+        <w:t xml:space="preserve"> </w:t>
+      </w:r>
+      <w:r>
+        <w:t xml:space="preserve">and low surgical risk, with complete excision serving as both diagnostic</w:t>
+      </w:r>
+      <w:r>
+        <w:t xml:space="preserve"> </w:t>
+      </w:r>
+      <w:r>
+        <w:t xml:space="preserve">and therapeutic — a limitation that should be recognised in the absence</w:t>
+      </w:r>
+      <w:r>
+        <w:t xml:space="preserve"> </w:t>
+      </w:r>
+      <w:r>
+        <w:t xml:space="preserve">of pre-operative histological confirmation. The reactive interpretation</w:t>
+      </w:r>
+      <w:r>
+        <w:t xml:space="preserve"> </w:t>
+      </w:r>
+      <w:r>
+        <w:t xml:space="preserve">of regional lymphadenopathy remains inferential.</w:t>
       </w:r>
     </w:p>
     <w:p>
@@ -1341,19 +1473,13 @@
         <w:t xml:space="preserve"> </w:t>
       </w:r>
       <w:r>
-        <w:t xml:space="preserve">for histopathological confirmation. Concurrent ureteral stenting should</w:t>
-      </w:r>
-      <w:r>
-        <w:t xml:space="preserve"> </w:t>
-      </w:r>
-      <w:r>
-        <w:t xml:space="preserve">be considered when hydronephrosis is present. Complete excision is</w:t>
-      </w:r>
-      <w:r>
-        <w:t xml:space="preserve"> </w:t>
-      </w:r>
-      <w:r>
-        <w:t xml:space="preserve">curative.</w:t>
+        <w:t xml:space="preserve">for histopathological confirmation. Prophylactic ureteral stenting should be considered when the mass is in</w:t>
+      </w:r>
+      <w:r>
+        <w:t xml:space="preserve"> </w:t>
+      </w:r>
+      <w:r>
+        <w:t xml:space="preserve">proximity to the ureter. Complete excision is curative.</w:t>
       </w:r>
     </w:p>
     <w:p>
@@ -1368,7 +1494,7 @@
         <w:pStyle w:val="FirstParagraph"/>
       </w:pPr>
       <w:r>
-        <w:t xml:space="preserve">References</w:t>
+        <w:t xml:space="preserve">Patient Perspective</w:t>
       </w:r>
     </w:p>
     <w:p>
@@ -1376,297 +1502,20 @@
         <w:pStyle w:val="BodyText"/>
       </w:pPr>
       <w:r>
-        <w:t xml:space="preserve">Bates, D. D. B., Fernandes de Paula, M. C., Horvat, N., Sheedy, S.,</w:t>
-      </w:r>
-      <w:r>
-        <w:t xml:space="preserve"> </w:t>
-      </w:r>
-      <w:r>
-        <w:t xml:space="preserve">Lall, C., Kassam, Z., Pickhardt, P., Lalwani, N., Ganeshan, D. M., &amp;</w:t>
-      </w:r>
-      <w:r>
-        <w:t xml:space="preserve"> </w:t>
-      </w:r>
-      <w:r>
-        <w:t xml:space="preserve">Petkovska, I. (2019). Beyond adenocarcinoma: MRI of uncommon rectal</w:t>
-      </w:r>
-      <w:r>
-        <w:t xml:space="preserve"> </w:t>
-      </w:r>
-      <w:r>
-        <w:t xml:space="preserve">neoplasms and mimickers. RadioGraphics, 40(1), 205–222.</w:t>
-      </w:r>
-      <w:r>
-        <w:t xml:space="preserve"> </w:t>
-      </w:r>
-      <w:hyperlink r:id="rId9">
-        <w:r>
-          <w:rPr>
-            <w:rStyle w:val="Hyperlink"/>
-          </w:rPr>
-          <w:t xml:space="preserve">https://pmc.ncbi.nlm.nih.gov/articles/PMC7386089/</w:t>
-        </w:r>
-      </w:hyperlink>
-    </w:p>
-    <w:p>
-      <w:pPr>
-        <w:pStyle w:val="BodyText"/>
-      </w:pPr>
-      <w:r>
-        <w:t xml:space="preserve">Fdili Alaoui, F. Z., Oussaden, A., Bouguern, H., El Fatemi, H., Melhouf,</w:t>
-      </w:r>
-      <w:r>
-        <w:t xml:space="preserve"> </w:t>
-      </w:r>
-      <w:r>
-        <w:t xml:space="preserve">M. A., Amarti, A., &amp; Ait Taleb, K. (2012). Giant pelvic retroperitoneal</w:t>
-      </w:r>
-      <w:r>
-        <w:t xml:space="preserve"> </w:t>
-      </w:r>
-      <w:r>
-        <w:t xml:space="preserve">epidermoid cyst: A rare case report. Pan African Medical Journal, 13,</w:t>
-      </w:r>
-      <w:r>
-        <w:t xml:space="preserve"> </w:t>
-      </w:r>
-      <w:r>
-        <w:t xml:space="preserve">51.</w:t>
-      </w:r>
-      <w:r>
-        <w:t xml:space="preserve"> </w:t>
-      </w:r>
-      <w:hyperlink r:id="rId10">
-        <w:r>
-          <w:rPr>
-            <w:rStyle w:val="Hyperlink"/>
-          </w:rPr>
-          <w:t xml:space="preserve">https://www.ncbi.nlm.nih.gov/pmc/articles/PMC3485512/</w:t>
-        </w:r>
-      </w:hyperlink>
-    </w:p>
-    <w:p>
-      <w:pPr>
-        <w:pStyle w:val="BodyText"/>
-      </w:pPr>
-      <w:r>
-        <w:t xml:space="preserve">Hyseni, N. S., Llullaku, S. S., Koçinaj, D. H., Jashari, H. J., &amp;</w:t>
-      </w:r>
-      <w:r>
-        <w:t xml:space="preserve"> </w:t>
-      </w:r>
-      <w:r>
-        <w:t xml:space="preserve">Kelmendi, B. Z. (2009). An unusual location of retroperitoneal</w:t>
-      </w:r>
-      <w:r>
-        <w:t xml:space="preserve"> </w:t>
-      </w:r>
-      <w:r>
-        <w:t xml:space="preserve">epidermoid cyst in a child: A case report. Cases Journal, 2, 9362.</w:t>
-      </w:r>
-      <w:r>
-        <w:t xml:space="preserve"> </w:t>
-      </w:r>
-      <w:hyperlink r:id="rId11">
-        <w:r>
-          <w:rPr>
-            <w:rStyle w:val="Hyperlink"/>
-          </w:rPr>
-          <w:t xml:space="preserve">https://pmc.ncbi.nlm.nih.gov/articles/PMC2804735/</w:t>
-        </w:r>
-      </w:hyperlink>
-    </w:p>
-    <w:p>
-      <w:pPr>
-        <w:pStyle w:val="BodyText"/>
-      </w:pPr>
-      <w:r>
-        <w:t xml:space="preserve">Hu, T., Wang, D., Tian, Y., Yuan, X., &amp; Li, Y. (2022). Abdominal giant</w:t>
-      </w:r>
-      <w:r>
-        <w:t xml:space="preserve"> </w:t>
-      </w:r>
-      <w:r>
-        <w:t xml:space="preserve">epidermoid cyst with squamous epithelial heterogeneous proliferation</w:t>
-      </w:r>
-      <w:r>
-        <w:t xml:space="preserve"> </w:t>
-      </w:r>
-      <w:r>
-        <w:t xml:space="preserve">carcinoma: A case report. Translational Cancer Research, 11(5),</w:t>
-      </w:r>
-      <w:r>
-        <w:t xml:space="preserve"> </w:t>
-      </w:r>
-      <w:r>
-        <w:t xml:space="preserve">1457–1462.</w:t>
-      </w:r>
-      <w:r>
-        <w:t xml:space="preserve"> </w:t>
-      </w:r>
-      <w:hyperlink r:id="rId12">
-        <w:r>
-          <w:rPr>
-            <w:rStyle w:val="Hyperlink"/>
-          </w:rPr>
-          <w:t xml:space="preserve">https://pmc.ncbi.nlm.nih.gov/articles/PMC9189159/</w:t>
-        </w:r>
-      </w:hyperlink>
-    </w:p>
-    <w:p>
-      <w:pPr>
-        <w:pStyle w:val="BodyText"/>
-      </w:pPr>
-      <w:r>
-        <w:t xml:space="preserve">Jain, P., &amp; Pal, D. K. (2018). Pelvic epidermoid cyst: A rare cause of</w:t>
-      </w:r>
-      <w:r>
-        <w:t xml:space="preserve"> </w:t>
-      </w:r>
-      <w:r>
-        <w:t xml:space="preserve">lower urinary tract symptoms. BMJ Case Reports, 2018, bcr2017223386.</w:t>
-      </w:r>
-      <w:r>
-        <w:t xml:space="preserve"> </w:t>
-      </w:r>
-      <w:hyperlink r:id="rId13">
-        <w:r>
-          <w:rPr>
-            <w:rStyle w:val="Hyperlink"/>
-          </w:rPr>
-          <w:t xml:space="preserve">https://pmc.ncbi.nlm.nih.gov/articles/PMC5965764/</w:t>
-        </w:r>
-      </w:hyperlink>
-    </w:p>
-    <w:p>
-      <w:pPr>
-        <w:pStyle w:val="BodyText"/>
-      </w:pPr>
-      <w:r>
-        <w:t xml:space="preserve">Kesavan, R., Parthasarathi, R., Gupta, A., &amp; Palanivelu, C. (2019).</w:t>
-      </w:r>
-      <w:r>
-        <w:t xml:space="preserve"> </w:t>
-      </w:r>
-      <w:r>
-        <w:t xml:space="preserve">Laparoscopic management of epidermoid cyst in an unusual location: A</w:t>
-      </w:r>
-      <w:r>
-        <w:t xml:space="preserve"> </w:t>
-      </w:r>
-      <w:r>
-        <w:t xml:space="preserve">case report. Journal of Medical Case Reports, 13, 47.</w:t>
-      </w:r>
-      <w:r>
-        <w:t xml:space="preserve"> </w:t>
-      </w:r>
-      <w:hyperlink r:id="rId14">
-        <w:r>
-          <w:rPr>
-            <w:rStyle w:val="Hyperlink"/>
-          </w:rPr>
-          <w:t xml:space="preserve">https://pmc.ncbi.nlm.nih.gov/articles/PMC6381951/</w:t>
-        </w:r>
-      </w:hyperlink>
-    </w:p>
-    <w:p>
-      <w:pPr>
-        <w:pStyle w:val="BodyText"/>
-      </w:pPr>
-      <w:r>
-        <w:t xml:space="preserve">Koppel, B. S., &amp; Weinberger, G. (1987). Radiologic evaluation of</w:t>
-      </w:r>
-      <w:r>
-        <w:t xml:space="preserve"> </w:t>
-      </w:r>
-      <w:r>
-        <w:t xml:space="preserve">epidermoid cyst. Journal of the National Medical Association, 79(2),</w:t>
-      </w:r>
-      <w:r>
-        <w:t xml:space="preserve"> </w:t>
-      </w:r>
-      <w:r>
-        <w:t xml:space="preserve">209–212.</w:t>
-      </w:r>
-      <w:r>
-        <w:t xml:space="preserve"> </w:t>
-      </w:r>
-      <w:hyperlink r:id="rId15">
-        <w:r>
-          <w:rPr>
-            <w:rStyle w:val="Hyperlink"/>
-          </w:rPr>
-          <w:t xml:space="preserve">https://pmc.ncbi.nlm.nih.gov/articles/PMC2571445/</w:t>
-        </w:r>
-      </w:hyperlink>
-    </w:p>
-    <w:p>
-      <w:pPr>
-        <w:pStyle w:val="BodyText"/>
-      </w:pPr>
-      <w:r>
-        <w:t xml:space="preserve">Nasim, S., Kumar, S., Azim, D., Rai, L., &amp; Saeed, S. (2020). Retrorectal</w:t>
-      </w:r>
-      <w:r>
-        <w:t xml:space="preserve"> </w:t>
-      </w:r>
-      <w:r>
-        <w:t xml:space="preserve">epidermal inclusion cyst: An incidental finding during cesarean section.</w:t>
-      </w:r>
-      <w:r>
-        <w:t xml:space="preserve"> </w:t>
-      </w:r>
-      <w:r>
-        <w:t xml:space="preserve">International Journal of Surgery Case Reports, 77, 467–470.</w:t>
-      </w:r>
-      <w:r>
-        <w:t xml:space="preserve"> </w:t>
-      </w:r>
-      <w:hyperlink r:id="rId16">
-        <w:r>
-          <w:rPr>
-            <w:rStyle w:val="Hyperlink"/>
-          </w:rPr>
-          <w:t xml:space="preserve">https://pmc.ncbi.nlm.nih.gov/articles/PMC7710341/</w:t>
-        </w:r>
-      </w:hyperlink>
-    </w:p>
-    <w:p>
-      <w:pPr>
-        <w:pStyle w:val="BodyText"/>
-      </w:pPr>
-      <w:r>
-        <w:t xml:space="preserve">AlSulimani, S. O., Almalki, A. M., Alzahrani, K. A., Alshehri, A. O., &amp;</w:t>
-      </w:r>
-      <w:r>
-        <w:t xml:space="preserve"> </w:t>
-      </w:r>
-      <w:r>
-        <w:t xml:space="preserve">Almotairi, R. (2023). Infected giant right seminal vesicle epidermoid</w:t>
-      </w:r>
-      <w:r>
-        <w:t xml:space="preserve"> </w:t>
-      </w:r>
-      <w:r>
-        <w:t xml:space="preserve">cyst in a young male patient: A case report. International Journal of</w:t>
-      </w:r>
-      <w:r>
-        <w:t xml:space="preserve"> </w:t>
-      </w:r>
-      <w:r>
-        <w:t xml:space="preserve">Surgery Case Reports, 110, 108732.</w:t>
-      </w:r>
-      <w:r>
-        <w:t xml:space="preserve"> </w:t>
-      </w:r>
-      <w:hyperlink r:id="rId17">
-        <w:r>
-          <w:rPr>
-            <w:rStyle w:val="Hyperlink"/>
-          </w:rPr>
-          <w:t xml:space="preserve">https://pmc.ncbi.nlm.nih.gov/articles/PMC10493493/</w:t>
-        </w:r>
-      </w:hyperlink>
+        <w:t xml:space="preserve">The patient reported resolution of pre-operative lower abdominal pain,</w:t>
+      </w:r>
+      <w:r>
+        <w:t xml:space="preserve"> </w:t>
+      </w:r>
+      <w:r>
+        <w:t xml:space="preserve">hematuria, and rectal tenesmus during the post-operative course, and</w:t>
+      </w:r>
+      <w:r>
+        <w:t xml:space="preserve"> </w:t>
+      </w:r>
+      <w:r>
+        <w:t xml:space="preserve">expressed satisfaction with the surgical outcome at discharge.</w:t>
+      </w:r>
     </w:p>
     <w:p>
       <w:r>
@@ -1680,172 +1529,7 @@
         <w:pStyle w:val="FirstParagraph"/>
       </w:pPr>
       <w:r>
-        <w:t xml:space="preserve">Figure Legends</w:t>
-      </w:r>
-    </w:p>
-    <w:p>
-      <w:pPr>
-        <w:pStyle w:val="BodyText"/>
-      </w:pPr>
-      <w:r>
-        <w:t xml:space="preserve">Figure 1. Histopathological section of the excised pelvic floor mass</w:t>
-      </w:r>
-      <w:r>
-        <w:t xml:space="preserve"> </w:t>
-      </w:r>
-      <w:r>
-        <w:t xml:space="preserve">(hematoxylin and eosin stain). The cyst wall is composed of dense</w:t>
-      </w:r>
-      <w:r>
-        <w:t xml:space="preserve"> </w:t>
-      </w:r>
-      <w:r>
-        <w:t xml:space="preserve">fibrous tissue lined by stratified squamous epithelium with a granular</w:t>
-      </w:r>
-      <w:r>
-        <w:t xml:space="preserve"> </w:t>
-      </w:r>
-      <w:r>
-        <w:t xml:space="preserve">layer. The cyst lumen contains laminated keratin fragments. No hair</w:t>
-      </w:r>
-      <w:r>
-        <w:t xml:space="preserve"> </w:t>
-      </w:r>
-      <w:r>
-        <w:t xml:space="preserve">follicles or sebaceous glands are identified, consistent with an</w:t>
-      </w:r>
-      <w:r>
-        <w:t xml:space="preserve"> </w:t>
-      </w:r>
-      <w:r>
-        <w:t xml:space="preserve">epidermoid cyst.</w:t>
-      </w:r>
-    </w:p>
-    <w:p>
-      <w:pPr>
-        <w:pStyle w:val="BodyText"/>
-      </w:pPr>
-      <w:r>
-        <w:t xml:space="preserve">Figure 2. Contrast-enhanced CT of the abdomen and pelvis. (A) Coronal</w:t>
-      </w:r>
-      <w:r>
-        <w:t xml:space="preserve"> </w:t>
-      </w:r>
-      <w:r>
-        <w:t xml:space="preserve">view demonstrating a large, well-defined pelvic floor mass with no</w:t>
-      </w:r>
-      <w:r>
-        <w:t xml:space="preserve"> </w:t>
-      </w:r>
-      <w:r>
-        <w:t xml:space="preserve">internal enhancement. (B) Axial view at the level of the pelvic inlet</w:t>
-      </w:r>
-      <w:r>
-        <w:t xml:space="preserve"> </w:t>
-      </w:r>
-      <w:r>
-        <w:t xml:space="preserve">showing the 10 cm non-enhancing mass abutting the left lateral rectal</w:t>
-      </w:r>
-      <w:r>
-        <w:t xml:space="preserve"> </w:t>
-      </w:r>
-      <w:r>
-        <w:t xml:space="preserve">wall, with apparent lymphadenopathy in the right internal iliac region.</w:t>
-      </w:r>
-      <w:r>
-        <w:t xml:space="preserve"> </w:t>
-      </w:r>
-      <w:r>
-        <w:t xml:space="preserve">Left hydronephrosis is also noted. The yellow line in panel (B)</w:t>
-      </w:r>
-      <w:r>
-        <w:t xml:space="preserve"> </w:t>
-      </w:r>
-      <w:r>
-        <w:t xml:space="preserve">indicates a measurement annotation from the PACS workstation.</w:t>
-      </w:r>
-    </w:p>
-    <w:p>
-      <w:pPr>
-        <w:pStyle w:val="BodyText"/>
-      </w:pPr>
-      <w:r>
-        <w:t xml:space="preserve">Figure 3. Colonoscopy image of the rectum demonstrating smooth external</w:t>
-      </w:r>
-      <w:r>
-        <w:t xml:space="preserve"> </w:t>
-      </w:r>
-      <w:r>
-        <w:t xml:space="preserve">compression of the rectal wall without mucosal ulceration, friability,</w:t>
-      </w:r>
-      <w:r>
-        <w:t xml:space="preserve"> </w:t>
-      </w:r>
-      <w:r>
-        <w:t xml:space="preserve">or intraluminal tumor, confirming that the pelvic mass is extrinsic to</w:t>
-      </w:r>
-      <w:r>
-        <w:t xml:space="preserve"> </w:t>
-      </w:r>
-      <w:r>
-        <w:t xml:space="preserve">the bowel.</w:t>
-      </w:r>
-    </w:p>
-    <w:p>
-      <w:r>
-        <w:pict>
-          <v:rect style="width:0;height:1.5pt" o:hralign="center" o:hrstd="t" o:hr="t"/>
-        </w:pict>
-      </w:r>
-    </w:p>
-    <w:p>
-      <w:pPr>
-        <w:pStyle w:val="FirstParagraph"/>
-      </w:pPr>
-      <w:r>
-        <w:t xml:space="preserve">Mandatory Disclosures</w:t>
-      </w:r>
-    </w:p>
-    <w:p>
-      <w:pPr>
-        <w:pStyle w:val="BodyText"/>
-      </w:pPr>
-      <w:r>
-        <w:t xml:space="preserve">Ethics Declaration: This case report was conducted in accordance with</w:t>
-      </w:r>
-      <w:r>
-        <w:t xml:space="preserve"> </w:t>
-      </w:r>
-      <w:r>
-        <w:t xml:space="preserve">the Declaration of Helsinki. Institutional review board approval was</w:t>
-      </w:r>
-      <w:r>
-        <w:t xml:space="preserve"> </w:t>
-      </w:r>
-      <w:r>
-        <w:t xml:space="preserve">obtained / waived for case reports at the reporting institution.</w:t>
-      </w:r>
-    </w:p>
-    <w:p>
-      <w:pPr>
-        <w:pStyle w:val="BodyText"/>
-      </w:pPr>
-      <w:r>
-        <w:t xml:space="preserve">Patient Consent: Written informed consent was obtained from the patient</w:t>
-      </w:r>
-      <w:r>
-        <w:t xml:space="preserve"> </w:t>
-      </w:r>
-      <w:r>
-        <w:t xml:space="preserve">for publication of this case report and any accompanying images.</w:t>
-      </w:r>
-    </w:p>
-    <w:p>
-      <w:pPr>
-        <w:pStyle w:val="BodyText"/>
-      </w:pPr>
-      <w:r>
-        <w:t xml:space="preserve">Author Contributions (CRediT):</w:t>
+        <w:t xml:space="preserve">References</w:t>
       </w:r>
     </w:p>
     <w:p>
@@ -1856,6 +1540,723 @@
         </w:numPr>
       </w:pPr>
       <w:r>
+        <w:t xml:space="preserve">Fdili Alaoui FZ, Oussaden A, Bouguern H, El Fatemi H, Melhouf MA,</w:t>
+      </w:r>
+      <w:r>
+        <w:t xml:space="preserve"> </w:t>
+      </w:r>
+      <w:r>
+        <w:t xml:space="preserve">Amarti A, et al. Giant pelvic retroperitoneal epidermoid cyst: a rare</w:t>
+      </w:r>
+      <w:r>
+        <w:t xml:space="preserve"> </w:t>
+      </w:r>
+      <w:r>
+        <w:t xml:space="preserve">case report. Pan Afr Med J. 2012;13:51.</w:t>
+      </w:r>
+    </w:p>
+    <w:p>
+      <w:pPr>
+        <w:numPr>
+          <w:ilvl w:val="0"/>
+          <w:numId w:val="1005"/>
+        </w:numPr>
+      </w:pPr>
+      <w:r>
+        <w:t xml:space="preserve">Jain P, Pal DK. Pelvic epidermoid cyst: a rare cause of lower urinary</w:t>
+      </w:r>
+      <w:r>
+        <w:t xml:space="preserve"> </w:t>
+      </w:r>
+      <w:r>
+        <w:t xml:space="preserve">tract symptoms. BMJ Case Rep. 2018;2018:bcr2017223386.</w:t>
+      </w:r>
+    </w:p>
+    <w:p>
+      <w:pPr>
+        <w:numPr>
+          <w:ilvl w:val="0"/>
+          <w:numId w:val="1005"/>
+        </w:numPr>
+      </w:pPr>
+      <w:r>
+        <w:t xml:space="preserve">Nasim S, Kumar S, Azim D, Rai L, Saeed S. Retrorectal epidermal</w:t>
+      </w:r>
+      <w:r>
+        <w:t xml:space="preserve"> </w:t>
+      </w:r>
+      <w:r>
+        <w:t xml:space="preserve">inclusion cyst: an incidental finding during cesarean section.</w:t>
+      </w:r>
+      <w:r>
+        <w:t xml:space="preserve"> </w:t>
+      </w:r>
+      <w:r>
+        <w:t xml:space="preserve">Int J Surg Case Rep. 2020;77:467–70.</w:t>
+      </w:r>
+    </w:p>
+    <w:p>
+      <w:pPr>
+        <w:numPr>
+          <w:ilvl w:val="0"/>
+          <w:numId w:val="1005"/>
+        </w:numPr>
+      </w:pPr>
+      <w:r>
+        <w:t xml:space="preserve">Hyseni NS, Llullaku SS, Koçinaj DH, Jashari HJ, Kelmendi BZ. An</w:t>
+      </w:r>
+      <w:r>
+        <w:t xml:space="preserve"> </w:t>
+      </w:r>
+      <w:r>
+        <w:t xml:space="preserve">unusual location of retroperitoneal epidermoid cyst in a child: a case</w:t>
+      </w:r>
+      <w:r>
+        <w:t xml:space="preserve"> </w:t>
+      </w:r>
+      <w:r>
+        <w:t xml:space="preserve">report. Cases J. 2009;2:9362.</w:t>
+      </w:r>
+    </w:p>
+    <w:p>
+      <w:pPr>
+        <w:numPr>
+          <w:ilvl w:val="0"/>
+          <w:numId w:val="1005"/>
+        </w:numPr>
+      </w:pPr>
+      <w:r>
+        <w:t xml:space="preserve">Bates DDB, Fernandes de Paula MC, Horvat N, Sheedy S, Lall C,</w:t>
+      </w:r>
+      <w:r>
+        <w:t xml:space="preserve"> </w:t>
+      </w:r>
+      <w:r>
+        <w:t xml:space="preserve">Kassam Z, et al. Beyond adenocarcinoma: MRI of uncommon rectal</w:t>
+      </w:r>
+      <w:r>
+        <w:t xml:space="preserve"> </w:t>
+      </w:r>
+      <w:r>
+        <w:t xml:space="preserve">neoplasms and mimickers. Radiographics. 2019;40(1):205–22.</w:t>
+      </w:r>
+    </w:p>
+    <w:p>
+      <w:pPr>
+        <w:numPr>
+          <w:ilvl w:val="0"/>
+          <w:numId w:val="1005"/>
+        </w:numPr>
+      </w:pPr>
+      <w:r>
+        <w:t xml:space="preserve">Kesavan R, Parthasarathi R, Gupta A, Palanivelu C. Laparoscopic</w:t>
+      </w:r>
+      <w:r>
+        <w:t xml:space="preserve"> </w:t>
+      </w:r>
+      <w:r>
+        <w:t xml:space="preserve">management of epidermoid cyst in an unusual location: a case report.</w:t>
+      </w:r>
+      <w:r>
+        <w:t xml:space="preserve"> </w:t>
+      </w:r>
+      <w:r>
+        <w:t xml:space="preserve">J Med Case Rep. 2019;13:47.</w:t>
+      </w:r>
+    </w:p>
+    <w:p>
+      <w:pPr>
+        <w:numPr>
+          <w:ilvl w:val="0"/>
+          <w:numId w:val="1005"/>
+        </w:numPr>
+      </w:pPr>
+      <w:r>
+        <w:t xml:space="preserve">AlSulimani SO, Almalki AM, Alzahrani KA, Alshehri AO, Almotairi R.</w:t>
+      </w:r>
+      <w:r>
+        <w:t xml:space="preserve"> </w:t>
+      </w:r>
+      <w:r>
+        <w:t xml:space="preserve">Infected giant right seminal vesicle epidermoid cyst in a young male</w:t>
+      </w:r>
+      <w:r>
+        <w:t xml:space="preserve"> </w:t>
+      </w:r>
+      <w:r>
+        <w:t xml:space="preserve">patient: a case report. Int J Surg Case Rep. 2023;110:108732.</w:t>
+      </w:r>
+    </w:p>
+    <w:p>
+      <w:pPr>
+        <w:numPr>
+          <w:ilvl w:val="0"/>
+          <w:numId w:val="1005"/>
+        </w:numPr>
+      </w:pPr>
+      <w:r>
+        <w:t xml:space="preserve">Koppel BS, Weinberger G. Radiologic evaluation of epidermoid cyst.</w:t>
+      </w:r>
+      <w:r>
+        <w:t xml:space="preserve"> </w:t>
+      </w:r>
+      <w:r>
+        <w:t xml:space="preserve">J Natl Med Assoc. 1987;79(2):209–12.</w:t>
+      </w:r>
+    </w:p>
+    <w:p>
+      <w:pPr>
+        <w:numPr>
+          <w:ilvl w:val="0"/>
+          <w:numId w:val="1005"/>
+        </w:numPr>
+      </w:pPr>
+      <w:r>
+        <w:t xml:space="preserve">Hu T, Wang D, Tian Y, Yuan X, Li Y. Abdominal giant epidermoid cyst</w:t>
+      </w:r>
+      <w:r>
+        <w:t xml:space="preserve"> </w:t>
+      </w:r>
+      <w:r>
+        <w:t xml:space="preserve">with squamous epithelial heterogeneous proliferation carcinoma: a case</w:t>
+      </w:r>
+      <w:r>
+        <w:t xml:space="preserve"> </w:t>
+      </w:r>
+      <w:r>
+        <w:t xml:space="preserve">report. Transl Cancer Res. 2022;11(5):1457–62.</w:t>
+      </w:r>
+    </w:p>
+    <w:p>
+      <w:r>
+        <w:pict>
+          <v:rect style="width:0;height:1.5pt" o:hralign="center" o:hrstd="t" o:hr="t"/>
+        </w:pict>
+      </w:r>
+    </w:p>
+    <w:p>
+      <w:pPr>
+        <w:pStyle w:val="FirstParagraph"/>
+      </w:pPr>
+      <w:r>
+        <w:t xml:space="preserve">Table 1. Clinical timeline of the present case.</w:t>
+      </w:r>
+    </w:p>
+    <w:tbl>
+      <w:tblPr>
+        <w:tblStyle w:val="Table"/>
+        <w:tblW w:type="pct" w:w="5000"/>
+        <w:tblLayout w:type="fixed"/>
+        <w:tblLook w:firstRow="1" w:lastRow="0" w:firstColumn="0" w:lastColumn="0" w:noHBand="0" w:noVBand="0" w:val="0020"/>
+      </w:tblPr>
+      <w:tblGrid>
+        <w:gridCol w:w="3960"/>
+        <w:gridCol w:w="3960"/>
+      </w:tblGrid>
+      <w:tr>
+        <w:trPr>
+          <w:tblHeader w:val="on"/>
+        </w:trPr>
+        <w:tc>
+          <w:tcPr/>
+          <w:p>
+            <w:pPr>
+              <w:pStyle w:val="Compact"/>
+            </w:pPr>
+            <w:r>
+              <w:t xml:space="preserve">Timepoint</w:t>
+            </w:r>
+          </w:p>
+        </w:tc>
+        <w:tc>
+          <w:tcPr/>
+          <w:p>
+            <w:pPr>
+              <w:pStyle w:val="Compact"/>
+            </w:pPr>
+            <w:r>
+              <w:t xml:space="preserve">Event</w:t>
+            </w:r>
+          </w:p>
+        </w:tc>
+      </w:tr>
+      <w:tr>
+        <w:tc>
+          <w:tcPr/>
+          <w:p>
+            <w:pPr>
+              <w:pStyle w:val="Compact"/>
+            </w:pPr>
+            <w:r>
+              <w:t xml:space="preserve">~2 months before presentation</w:t>
+            </w:r>
+          </w:p>
+        </w:tc>
+        <w:tc>
+          <w:tcPr/>
+          <w:p>
+            <w:pPr>
+              <w:pStyle w:val="Compact"/>
+            </w:pPr>
+            <w:r>
+              <w:t xml:space="preserve">Onset of bowel habit changes and rectal tenesmus</w:t>
+            </w:r>
+          </w:p>
+        </w:tc>
+      </w:tr>
+      <w:tr>
+        <w:tc>
+          <w:tcPr/>
+          <w:p>
+            <w:pPr>
+              <w:pStyle w:val="Compact"/>
+            </w:pPr>
+            <w:r>
+              <w:t xml:space="preserve">~2 weeks before presentation</w:t>
+            </w:r>
+          </w:p>
+        </w:tc>
+        <w:tc>
+          <w:tcPr/>
+          <w:p>
+            <w:pPr>
+              <w:pStyle w:val="Compact"/>
+            </w:pPr>
+            <w:r>
+              <w:t xml:space="preserve">Onset of lower abdominal pain</w:t>
+            </w:r>
+          </w:p>
+        </w:tc>
+      </w:tr>
+      <w:tr>
+        <w:tc>
+          <w:tcPr/>
+          <w:p>
+            <w:pPr>
+              <w:pStyle w:val="Compact"/>
+            </w:pPr>
+            <w:r>
+              <w:t xml:space="preserve">~1 week before presentation</w:t>
+            </w:r>
+          </w:p>
+        </w:tc>
+        <w:tc>
+          <w:tcPr/>
+          <w:p>
+            <w:pPr>
+              <w:pStyle w:val="Compact"/>
+            </w:pPr>
+            <w:r>
+              <w:t xml:space="preserve">Hematuria identified on urinary catheterisation</w:t>
+            </w:r>
+          </w:p>
+        </w:tc>
+      </w:tr>
+      <w:tr>
+        <w:tc>
+          <w:tcPr/>
+          <w:p>
+            <w:pPr>
+              <w:pStyle w:val="Compact"/>
+            </w:pPr>
+            <w:r>
+              <w:t xml:space="preserve">March 1, 2026</w:t>
+            </w:r>
+          </w:p>
+        </w:tc>
+        <w:tc>
+          <w:tcPr/>
+          <w:p>
+            <w:pPr>
+              <w:pStyle w:val="Compact"/>
+            </w:pPr>
+            <w:r>
+              <w:t xml:space="preserve">Emergency presentation; CECT: 10 cm non-enhancing pelvic mass with apparent right internal iliac lymphadenopathy; leukocytosis and elevated CRP</w:t>
+            </w:r>
+          </w:p>
+        </w:tc>
+      </w:tr>
+      <w:tr>
+        <w:tc>
+          <w:tcPr/>
+          <w:p>
+            <w:pPr>
+              <w:pStyle w:val="Compact"/>
+            </w:pPr>
+            <w:r>
+              <w:t xml:space="preserve">March 2, 2026</w:t>
+            </w:r>
+          </w:p>
+        </w:tc>
+        <w:tc>
+          <w:tcPr/>
+          <w:p>
+            <w:pPr>
+              <w:pStyle w:val="Compact"/>
+            </w:pPr>
+            <w:r>
+              <w:t xml:space="preserve">Digital rectal examination: large firm mass, left lateral rectal wall, 4 cm from anal verge</w:t>
+            </w:r>
+          </w:p>
+        </w:tc>
+      </w:tr>
+      <w:tr>
+        <w:tc>
+          <w:tcPr/>
+          <w:p>
+            <w:pPr>
+              <w:pStyle w:val="Compact"/>
+            </w:pPr>
+            <w:r>
+              <w:t xml:space="preserve">March 3–9, 2026</w:t>
+            </w:r>
+          </w:p>
+        </w:tc>
+        <w:tc>
+          <w:tcPr/>
+          <w:p>
+            <w:pPr>
+              <w:pStyle w:val="Compact"/>
+            </w:pPr>
+            <w:r>
+              <w:t xml:space="preserve">Colonoscopy: no mucosal lesion; tumour markers (AFP, CEA, CA19-9): within normal limits; cardiac and pulmonary pre-operative evaluation: low surgical risk</w:t>
+            </w:r>
+          </w:p>
+        </w:tc>
+      </w:tr>
+      <w:tr>
+        <w:tc>
+          <w:tcPr/>
+          <w:p>
+            <w:pPr>
+              <w:pStyle w:val="Compact"/>
+            </w:pPr>
+            <w:r>
+              <w:t xml:space="preserve">March 10, 2026</w:t>
+            </w:r>
+          </w:p>
+        </w:tc>
+        <w:tc>
+          <w:tcPr/>
+          <w:p>
+            <w:pPr>
+              <w:pStyle w:val="Compact"/>
+            </w:pPr>
+            <w:r>
+              <w:t xml:space="preserve">Cystoscopic Double-J ureteral stenting + laparotomy; complete excision of pelvic floor cyst; Grade 3 left hydronephrosis confirmed intraoperatively</w:t>
+            </w:r>
+          </w:p>
+        </w:tc>
+      </w:tr>
+      <w:tr>
+        <w:tc>
+          <w:tcPr/>
+          <w:p>
+            <w:pPr>
+              <w:pStyle w:val="Compact"/>
+            </w:pPr>
+            <w:r>
+              <w:t xml:space="preserve">Post-operative day 3</w:t>
+            </w:r>
+          </w:p>
+        </w:tc>
+        <w:tc>
+          <w:tcPr/>
+          <w:p>
+            <w:pPr>
+              <w:pStyle w:val="Compact"/>
+            </w:pPr>
+            <w:r>
+              <w:t xml:space="preserve">First flatus</w:t>
+            </w:r>
+          </w:p>
+        </w:tc>
+      </w:tr>
+      <w:tr>
+        <w:tc>
+          <w:tcPr/>
+          <w:p>
+            <w:pPr>
+              <w:pStyle w:val="Compact"/>
+            </w:pPr>
+            <w:r>
+              <w:t xml:space="preserve">Post-operative day 4</w:t>
+            </w:r>
+          </w:p>
+        </w:tc>
+        <w:tc>
+          <w:tcPr/>
+          <w:p>
+            <w:pPr>
+              <w:pStyle w:val="Compact"/>
+            </w:pPr>
+            <w:r>
+              <w:t xml:space="preserve">Oral diet resumed</w:t>
+            </w:r>
+          </w:p>
+        </w:tc>
+      </w:tr>
+      <w:tr>
+        <w:tc>
+          <w:tcPr/>
+          <w:p>
+            <w:pPr>
+              <w:pStyle w:val="Compact"/>
+            </w:pPr>
+            <w:r>
+              <w:t xml:space="preserve">Post-operative day 7</w:t>
+            </w:r>
+          </w:p>
+        </w:tc>
+        <w:tc>
+          <w:tcPr/>
+          <w:p>
+            <w:pPr>
+              <w:pStyle w:val="Compact"/>
+            </w:pPr>
+            <w:r>
+              <w:t xml:space="preserve">Surgical drain removed</w:t>
+            </w:r>
+          </w:p>
+        </w:tc>
+      </w:tr>
+      <w:tr>
+        <w:tc>
+          <w:tcPr/>
+          <w:p>
+            <w:pPr>
+              <w:pStyle w:val="Compact"/>
+            </w:pPr>
+            <w:r>
+              <w:t xml:space="preserve">March 19, 2026 (post-operative day 9)</w:t>
+            </w:r>
+          </w:p>
+        </w:tc>
+        <w:tc>
+          <w:tcPr/>
+          <w:p>
+            <w:pPr>
+              <w:pStyle w:val="Compact"/>
+            </w:pPr>
+            <w:r>
+              <w:t xml:space="preserve">Discharge; hematuria resolved; Cr 0.85 mg/dL, eGFR 99 mL/min/1.73 m²; Double-J stent in situ; final histopathology: epidermoid cyst</w:t>
+            </w:r>
+          </w:p>
+        </w:tc>
+      </w:tr>
+      <w:tr>
+        <w:tc>
+          <w:tcPr/>
+          <w:p>
+            <w:pPr>
+              <w:pStyle w:val="Compact"/>
+            </w:pPr>
+            <w:r>
+              <w:t xml:space="preserve">September 2026 (planned)</w:t>
+            </w:r>
+          </w:p>
+        </w:tc>
+        <w:tc>
+          <w:tcPr/>
+          <w:p>
+            <w:pPr>
+              <w:pStyle w:val="Compact"/>
+            </w:pPr>
+            <w:r>
+              <w:t xml:space="preserve">Tumour marker surveillance (CEA, CA19-9), CBC, biochemistry</w:t>
+            </w:r>
+          </w:p>
+        </w:tc>
+      </w:tr>
+    </w:tbl>
+    <w:p>
+      <w:r>
+        <w:pict>
+          <v:rect style="width:0;height:1.5pt" o:hralign="center" o:hrstd="t" o:hr="t"/>
+        </w:pict>
+      </w:r>
+    </w:p>
+    <w:p>
+      <w:pPr>
+        <w:pStyle w:val="FirstParagraph"/>
+      </w:pPr>
+      <w:r>
+        <w:t xml:space="preserve">Figure Legends</w:t>
+      </w:r>
+    </w:p>
+    <w:p>
+      <w:pPr>
+        <w:pStyle w:val="BodyText"/>
+      </w:pPr>
+      <w:r>
+        <w:t xml:space="preserve">Figure 1. Histopathological section of the excised pelvic floor mass</w:t>
+      </w:r>
+      <w:r>
+        <w:t xml:space="preserve"> </w:t>
+      </w:r>
+      <w:r>
+        <w:t xml:space="preserve">(hematoxylin and eosin stain). The cyst wall is composed of dense</w:t>
+      </w:r>
+      <w:r>
+        <w:t xml:space="preserve"> </w:t>
+      </w:r>
+      <w:r>
+        <w:t xml:space="preserve">fibrous tissue lined by stratified squamous epithelium with a granular</w:t>
+      </w:r>
+      <w:r>
+        <w:t xml:space="preserve"> </w:t>
+      </w:r>
+      <w:r>
+        <w:t xml:space="preserve">layer. The cyst lumen contains laminated keratin fragments. No hair</w:t>
+      </w:r>
+      <w:r>
+        <w:t xml:space="preserve"> </w:t>
+      </w:r>
+      <w:r>
+        <w:t xml:space="preserve">follicles or sebaceous glands are identified, consistent with an</w:t>
+      </w:r>
+      <w:r>
+        <w:t xml:space="preserve"> </w:t>
+      </w:r>
+      <w:r>
+        <w:t xml:space="preserve">epidermoid cyst.</w:t>
+      </w:r>
+    </w:p>
+    <w:p>
+      <w:pPr>
+        <w:pStyle w:val="BodyText"/>
+      </w:pPr>
+      <w:r>
+        <w:t xml:space="preserve">Figure 2. Contrast-enhanced CT of the abdomen and pelvis. (A) Coronal</w:t>
+      </w:r>
+      <w:r>
+        <w:t xml:space="preserve"> </w:t>
+      </w:r>
+      <w:r>
+        <w:t xml:space="preserve">view demonstrating a large, well-defined pelvic floor mass with no</w:t>
+      </w:r>
+      <w:r>
+        <w:t xml:space="preserve"> </w:t>
+      </w:r>
+      <w:r>
+        <w:t xml:space="preserve">internal enhancement. (B) Axial view at the level of the pelvic inlet</w:t>
+      </w:r>
+      <w:r>
+        <w:t xml:space="preserve"> </w:t>
+      </w:r>
+      <w:r>
+        <w:t xml:space="preserve">showing the 10 cm non-enhancing mass abutting the left lateral rectal</w:t>
+      </w:r>
+      <w:r>
+        <w:t xml:space="preserve"> </w:t>
+      </w:r>
+      <w:r>
+        <w:t xml:space="preserve">wall, with apparent lymphadenopathy in the right internal iliac region</w:t>
+      </w:r>
+      <w:r>
+        <w:t xml:space="preserve"> </w:t>
+      </w:r>
+      <w:r>
+        <w:t xml:space="preserve">and an incidental left renal calculus. The yellow line in panel (B)</w:t>
+      </w:r>
+      <w:r>
+        <w:t xml:space="preserve"> </w:t>
+      </w:r>
+      <w:r>
+        <w:t xml:space="preserve">indicates a measurement annotation from the PACS workstation.</w:t>
+      </w:r>
+    </w:p>
+    <w:p>
+      <w:pPr>
+        <w:pStyle w:val="BodyText"/>
+      </w:pPr>
+      <w:r>
+        <w:t xml:space="preserve">Figure 3. Colonoscopy image of the rectum demonstrating smooth external</w:t>
+      </w:r>
+      <w:r>
+        <w:t xml:space="preserve"> </w:t>
+      </w:r>
+      <w:r>
+        <w:t xml:space="preserve">compression of the rectal wall without mucosal ulceration, friability,</w:t>
+      </w:r>
+      <w:r>
+        <w:t xml:space="preserve"> </w:t>
+      </w:r>
+      <w:r>
+        <w:t xml:space="preserve">or intraluminal tumor, confirming that the pelvic mass is extrinsic to</w:t>
+      </w:r>
+      <w:r>
+        <w:t xml:space="preserve"> </w:t>
+      </w:r>
+      <w:r>
+        <w:t xml:space="preserve">the bowel.</w:t>
+      </w:r>
+    </w:p>
+    <w:p>
+      <w:r>
+        <w:pict>
+          <v:rect style="width:0;height:1.5pt" o:hralign="center" o:hrstd="t" o:hr="t"/>
+        </w:pict>
+      </w:r>
+    </w:p>
+    <w:p>
+      <w:pPr>
+        <w:pStyle w:val="FirstParagraph"/>
+      </w:pPr>
+      <w:r>
+        <w:t xml:space="preserve">Mandatory Disclosures</w:t>
+      </w:r>
+    </w:p>
+    <w:p>
+      <w:pPr>
+        <w:pStyle w:val="BodyText"/>
+      </w:pPr>
+      <w:r>
+        <w:t xml:space="preserve">Ethics Declaration: This case report was conducted in accordance with</w:t>
+      </w:r>
+      <w:r>
+        <w:t xml:space="preserve"> </w:t>
+      </w:r>
+      <w:r>
+        <w:t xml:space="preserve">the Declaration of Helsinki. Institutional review board approval was</w:t>
+      </w:r>
+      <w:r>
+        <w:t xml:space="preserve"> </w:t>
+      </w:r>
+      <w:r>
+        <w:t xml:space="preserve">obtained / waived for case reports at the reporting institution.</w:t>
+      </w:r>
+    </w:p>
+    <w:p>
+      <w:pPr>
+        <w:pStyle w:val="BodyText"/>
+      </w:pPr>
+      <w:r>
+        <w:t xml:space="preserve">Patient Consent: Written informed consent was obtained from the patient</w:t>
+      </w:r>
+      <w:r>
+        <w:t xml:space="preserve"> </w:t>
+      </w:r>
+      <w:r>
+        <w:t xml:space="preserve">for publication of this case report and any accompanying images.</w:t>
+      </w:r>
+    </w:p>
+    <w:p>
+      <w:pPr>
+        <w:pStyle w:val="BodyText"/>
+      </w:pPr>
+      <w:r>
+        <w:t xml:space="preserve">Author Contributions (CRediT):</w:t>
+      </w:r>
+    </w:p>
+    <w:p>
+      <w:pPr>
+        <w:numPr>
+          <w:ilvl w:val="0"/>
+          <w:numId w:val="1006"/>
+        </w:numPr>
+      </w:pPr>
+      <w:r>
         <w:t xml:space="preserve">Conceptualization: </w:t>
       </w:r>
       <w:r>
@@ -1869,7 +2270,7 @@
       <w:pPr>
         <w:numPr>
           <w:ilvl w:val="0"/>
-          <w:numId w:val="1005"/>
+          <w:numId w:val="1006"/>
         </w:numPr>
       </w:pPr>
       <w:r>
@@ -1886,7 +2287,7 @@
       <w:pPr>
         <w:numPr>
           <w:ilvl w:val="0"/>
-          <w:numId w:val="1005"/>
+          <w:numId w:val="1006"/>
         </w:numPr>
       </w:pPr>
       <w:r>
@@ -1903,7 +2304,7 @@
       <w:pPr>
         <w:numPr>
           <w:ilvl w:val="0"/>
-          <w:numId w:val="1005"/>
+          <w:numId w:val="1006"/>
         </w:numPr>
       </w:pPr>
       <w:r>
@@ -1920,7 +2321,7 @@
       <w:pPr>
         <w:numPr>
           <w:ilvl w:val="0"/>
-          <w:numId w:val="1005"/>
+          <w:numId w:val="1006"/>
         </w:numPr>
       </w:pPr>
       <w:r>
@@ -2672,6 +3073,36 @@
     </w:lvlOverride>
   </w:num>
   <w:num w:numId="1005">
+    <w:abstractNumId w:val="99411"/>
+    <w:lvlOverride w:ilvl="0">
+      <w:startOverride w:val="1"/>
+    </w:lvlOverride>
+    <w:lvlOverride w:ilvl="1">
+      <w:startOverride w:val="1"/>
+    </w:lvlOverride>
+    <w:lvlOverride w:ilvl="2">
+      <w:startOverride w:val="1"/>
+    </w:lvlOverride>
+    <w:lvlOverride w:ilvl="3">
+      <w:startOverride w:val="1"/>
+    </w:lvlOverride>
+    <w:lvlOverride w:ilvl="4">
+      <w:startOverride w:val="1"/>
+    </w:lvlOverride>
+    <w:lvlOverride w:ilvl="5">
+      <w:startOverride w:val="1"/>
+    </w:lvlOverride>
+    <w:lvlOverride w:ilvl="6">
+      <w:startOverride w:val="1"/>
+    </w:lvlOverride>
+    <w:lvlOverride w:ilvl="7">
+      <w:startOverride w:val="1"/>
+    </w:lvlOverride>
+    <w:lvlOverride w:ilvl="8">
+      <w:startOverride w:val="1"/>
+    </w:lvlOverride>
+  </w:num>
+  <w:num w:numId="1006">
     <w:abstractNumId w:val="991"/>
   </w:num>
 </w:numbering>

</xml_diff>

<commit_message>
feat: add IRB forms filling script and submission guide documentation
- Implemented `fill_irb_forms.py` to automate the completion of IRB forms with predefined data.
- Created `submission_guide.md` detailing the submission process, including writing assistance, manuscript editing, IRB document preparation, and final checks before submission.
</commit_message>
<xml_diff>
--- a/Case_Report_Epidermoid_Cyst_raw.docx
+++ b/Case_Report_Epidermoid_Cyst_raw.docx
@@ -21,7 +21,13 @@
         <w:pStyle w:val="BodyText"/>
       </w:pPr>
       <w:r>
-        <w:t xml:space="preserve">Wang Tzu-Chien, NP¹ and Chen Shu-Hung, MD¹</w:t>
+        <w:t xml:space="preserve">Wang Tzu-Chien, NP¹, Chen Shao-Kuan, MD², Wu Mei-Chih, NP¹,</w:t>
+      </w:r>
+      <w:r>
+        <w:t xml:space="preserve"> </w:t>
+      </w:r>
+      <w:r>
+        <w:t xml:space="preserve">and Chen Shu-Hung, MD¹</w:t>
       </w:r>
     </w:p>
     <w:p>
@@ -30,6 +36,18 @@
       </w:pPr>
       <w:r>
         <w:t xml:space="preserve">¹ Department of Colorectal Surgery, Xizhi Cathay General Hospital,</w:t>
+      </w:r>
+      <w:r>
+        <w:t xml:space="preserve"> </w:t>
+      </w:r>
+      <w:r>
+        <w:t xml:space="preserve">New Taipei City, Taiwan</w:t>
+      </w:r>
+      <w:r>
+        <w:t xml:space="preserve"> </w:t>
+      </w:r>
+      <w:r>
+        <w:t xml:space="preserve">² Department of Urology, Xizhi Cathay General Hospital,</w:t>
       </w:r>
       <w:r>
         <w:t xml:space="preserve"> </w:t>
@@ -481,13 +499,13 @@
         <w:t xml:space="preserve"> </w:t>
       </w:r>
       <w:r>
-        <w:t xml:space="preserve">hospital day two identified a large, firm mass at the 2 o’clock position</w:t>
-      </w:r>
-      <w:r>
-        <w:t xml:space="preserve"> </w:t>
-      </w:r>
-      <w:r>
-        <w:t xml:space="preserve">of the left lateral rectal wall, palpable approximately 4 cm from the</w:t>
+        <w:t xml:space="preserve">hospital day two identified a large, hard mass at the left-side 2 o’clock</w:t>
+      </w:r>
+      <w:r>
+        <w:t xml:space="preserve"> </w:t>
+      </w:r>
+      <w:r>
+        <w:t xml:space="preserve">position with luminal obstruction, palpable approximately 4 cm from the</w:t>
       </w:r>
       <w:r>
         <w:t xml:space="preserve"> </w:t>
@@ -637,19 +655,25 @@
         <w:t xml:space="preserve"> </w:t>
       </w:r>
       <w:r>
-        <w:t xml:space="preserve">guide surgical decision-making. The mass’s proximity to the left ureter raised concern for</w:t>
-      </w:r>
-      <w:r>
-        <w:t xml:space="preserve"> </w:t>
-      </w:r>
-      <w:r>
-        <w:t xml:space="preserve">intraoperative ureteral injury; cardiac and pulmonary evaluation</w:t>
-      </w:r>
-      <w:r>
-        <w:t xml:space="preserve"> </w:t>
-      </w:r>
-      <w:r>
-        <w:t xml:space="preserve">confirmed low surgical risk.</w:t>
+        <w:t xml:space="preserve">guide surgical decision-making. Urology consultation with independent CT review identified Grade 3 left</w:t>
+      </w:r>
+      <w:r>
+        <w:t xml:space="preserve"> </w:t>
+      </w:r>
+      <w:r>
+        <w:t xml:space="preserve">hydronephrosis (Society of Fetal Urology grading) — not documented in</w:t>
+      </w:r>
+      <w:r>
+        <w:t xml:space="preserve"> </w:t>
+      </w:r>
+      <w:r>
+        <w:t xml:space="preserve">the formal radiology report — confirming ureteral compression by the</w:t>
+      </w:r>
+      <w:r>
+        <w:t xml:space="preserve"> </w:t>
+      </w:r>
+      <w:r>
+        <w:t xml:space="preserve">mass; cardiac and pulmonary evaluation confirmed low surgical risk.</w:t>
       </w:r>
     </w:p>
     <w:p>
@@ -681,13 +705,13 @@
         <w:t xml:space="preserve"> </w:t>
       </w:r>
       <w:r>
-        <w:t xml:space="preserve">pelvic floor mass with Grade 3 left hydronephrosis (Society of Fetal Urology</w:t>
-      </w:r>
-      <w:r>
-        <w:t xml:space="preserve"> </w:t>
-      </w:r>
-      <w:r>
-        <w:t xml:space="preserve">grading). The cyst was intentionally decompressed by aspiration to facilitate</w:t>
+        <w:t xml:space="preserve">pelvic floor mass with Grade 3 left hydronephrosis, consistent with the</w:t>
+      </w:r>
+      <w:r>
+        <w:t xml:space="preserve"> </w:t>
+      </w:r>
+      <w:r>
+        <w:t xml:space="preserve">pre-operative urological assessment. The cyst was intentionally decompressed by aspiration to facilitate</w:t>
       </w:r>
       <w:r>
         <w:t xml:space="preserve"> </w:t>
@@ -1895,7 +1919,7 @@
               <w:pStyle w:val="Compact"/>
             </w:pPr>
             <w:r>
-              <w:t xml:space="preserve">Digital rectal examination: large firm mass, left lateral rectal wall, 4 cm from anal verge</w:t>
+              <w:t xml:space="preserve">Digital rectal examination: large hard mass at left-side 2 o’clock with luminal obstruction, 4 cm from anal verge</w:t>
             </w:r>
           </w:p>
         </w:tc>
@@ -1919,7 +1943,7 @@
               <w:pStyle w:val="Compact"/>
             </w:pPr>
             <w:r>
-              <w:t xml:space="preserve">Colonoscopy: no mucosal lesion; tumour markers (AFP, CEA, CA19-9): within normal limits; cardiac and pulmonary pre-operative evaluation: low surgical risk</w:t>
+              <w:t xml:space="preserve">Colonoscopy: no mucosal lesion; tumour markers (AFP, CEA, CA19-9): within normal limits; urology consultation — Grade 3 left hydronephrosis identified on CT review (not in formal radiology report); cardiac and pulmonary pre-operative evaluation: low surgical risk</w:t>
             </w:r>
           </w:p>
         </w:tc>
@@ -2280,7 +2304,16 @@
         <w:rPr>
           <w:rFonts w:hint="eastAsia"/>
         </w:rPr>
-        <w:t xml:space="preserve">王子建</w:t>
+        <w:t xml:space="preserve">王子建,</w:t>
+      </w:r>
+      <w:r>
+        <w:t xml:space="preserve"> </w:t>
+      </w:r>
+      <w:r>
+        <w:rPr>
+          <w:rFonts w:hint="eastAsia"/>
+        </w:rPr>
+        <w:t xml:space="preserve">吳美智</w:t>
       </w:r>
     </w:p>
     <w:p>
@@ -2291,6 +2324,32 @@
         </w:numPr>
       </w:pPr>
       <w:r>
+        <w:t xml:space="preserve">Investigation: </w:t>
+      </w:r>
+      <w:r>
+        <w:rPr>
+          <w:rFonts w:hint="eastAsia"/>
+        </w:rPr>
+        <w:t xml:space="preserve">陳紹寬,</w:t>
+      </w:r>
+      <w:r>
+        <w:t xml:space="preserve"> </w:t>
+      </w:r>
+      <w:r>
+        <w:rPr>
+          <w:rFonts w:hint="eastAsia"/>
+        </w:rPr>
+        <w:t xml:space="preserve">吳美智</w:t>
+      </w:r>
+    </w:p>
+    <w:p>
+      <w:pPr>
+        <w:numPr>
+          <w:ilvl w:val="0"/>
+          <w:numId w:val="1006"/>
+        </w:numPr>
+      </w:pPr>
+      <w:r>
         <w:t xml:space="preserve">Writing – original draft: </w:t>
       </w:r>
       <w:r>
@@ -2314,7 +2373,16 @@
         <w:rPr>
           <w:rFonts w:hint="eastAsia"/>
         </w:rPr>
-        <w:t xml:space="preserve">陳樞鴻</w:t>
+        <w:t xml:space="preserve">陳樞鴻,</w:t>
+      </w:r>
+      <w:r>
+        <w:t xml:space="preserve"> </w:t>
+      </w:r>
+      <w:r>
+        <w:rPr>
+          <w:rFonts w:hint="eastAsia"/>
+        </w:rPr>
+        <w:t xml:space="preserve">陳紹寬</w:t>
       </w:r>
     </w:p>
     <w:p>

</xml_diff>

<commit_message>
Add script to format DOCX documents for FJJM submission
- Set margins to 2.54 cm on all sides
- Add page numbers at the bottom center of each page
- Apply default paragraph formatting: left alignment, double spacing, Times New Roman 12 pt font
- Ensure tables are double-spaced with no color, shading, bold, or italic text
</commit_message>
<xml_diff>
--- a/Case_Report_Epidermoid_Cyst_raw.docx
+++ b/Case_Report_Epidermoid_Cyst_raw.docx
@@ -7,13 +7,13 @@
         <w:pStyle w:val="FirstParagraph"/>
       </w:pPr>
       <w:r>
-        <w:t xml:space="preserve">A Large Epidermoid Cyst of the Pelvic Floor Mimicking Rectal Submucosal</w:t>
-      </w:r>
-      <w:r>
-        <w:t xml:space="preserve"> </w:t>
-      </w:r>
-      <w:r>
-        <w:t xml:space="preserve">Malignancy: A Case Report</w:t>
+        <w:t xml:space="preserve">A Large Epidermoid Cyst of the Pelvic Floor Mimicking Rectal Malignancy:</w:t>
+      </w:r>
+      <w:r>
+        <w:t xml:space="preserve"> </w:t>
+      </w:r>
+      <w:r>
+        <w:t xml:space="preserve">A Case Report</w:t>
       </w:r>
     </w:p>
     <w:p>
@@ -190,13 +190,13 @@
         <w:t xml:space="preserve"> </w:t>
       </w:r>
       <w:r>
-        <w:t xml:space="preserve">be included in the differential. Complete surgical excision is</w:t>
-      </w:r>
-      <w:r>
-        <w:t xml:space="preserve"> </w:t>
-      </w:r>
-      <w:r>
-        <w:t xml:space="preserve">curative.</w:t>
+        <w:t xml:space="preserve">be included in the differential. Complete surgical excision offers an</w:t>
+      </w:r>
+      <w:r>
+        <w:t xml:space="preserve"> </w:t>
+      </w:r>
+      <w:r>
+        <w:t xml:space="preserve">excellent prognosis.</w:t>
       </w:r>
     </w:p>
     <w:p>
@@ -286,7 +286,7 @@
         <w:rPr>
           <w:rFonts w:hint="eastAsia"/>
         </w:rPr>
-        <w:t xml:space="preserve">A19-9）均在正常範圍，以及CT對比增強掃描下腫塊未見強化。考量腫塊緊鄰左輸尿管，術前預防性置入雙J管，術中確認左側輸水腎症。患者接受剖腹手術完整切除骨盆底腫塊，病理報告確認為硬皮囊腫，內壁為角化鱗狀上皮，含角蛋白碎片及纖維囊壁，無皮膚附屬器構造。</w:t>
+        <w:t xml:space="preserve">A19-9）均在正常範圍，以及CT對比增強掃描下腫塊未見強化。考量腫塊緊鄰左輸尿管，術前預防性置入雙J管，術中確認左側中重度腎水腫。患者接受剖腹手術完整切除骨盆底腫塊，病理報告確認為硬皮囊腫，內壁為角化鱗狀上皮，含角蛋白碎片及纖維囊壁，無皮膚附屬器構造。</w:t>
       </w:r>
     </w:p>
     <w:p>
@@ -306,7 +306,7 @@
         <w:rPr>
           <w:rFonts w:hint="eastAsia"/>
         </w:rPr>
-        <w:t xml:space="preserve">骨盆底硬皮囊腫應列入骨盆腔腫塊之鑑別診斷，尤以大腸鏡陰性且腫瘤標記正常時更應考慮。完整手術切除具治癒性，預後良好。</w:t>
+        <w:t xml:space="preserve">骨盆底硬皮囊腫應列入骨盆腔腫塊之鑑別診斷，尤以大腸鏡陰性且腫瘤標記正常時更應考慮。完整手術切除為確定性治療，預後良好。</w:t>
       </w:r>
     </w:p>
     <w:p>
@@ -353,13 +353,13 @@
         <w:pStyle w:val="FirstParagraph"/>
       </w:pPr>
       <w:r>
-        <w:t xml:space="preserve">Epidermoid cysts within the pelvic floor are exceedingly rare, with</w:t>
-      </w:r>
-      <w:r>
-        <w:t xml:space="preserve"> </w:t>
-      </w:r>
-      <w:r>
-        <w:t xml:space="preserve">fewer than 20 cases reported in the literature through 2024.</w:t>
+        <w:t xml:space="preserve">Epidermoid cysts within the pelvic floor are exceedingly rare, with, to our</w:t>
+      </w:r>
+      <w:r>
+        <w:t xml:space="preserve"> </w:t>
+      </w:r>
+      <w:r>
+        <w:t xml:space="preserve">knowledge, fewer than 20 cases reported in the literature through 2024.</w:t>
       </w:r>
       <w:r>
         <w:rPr>
@@ -549,25 +549,19 @@
         <w:t xml:space="preserve"> </w:t>
       </w:r>
       <w:r>
-        <w:t xml:space="preserve">(Figure 2). Additional findings included left renal calculus and an L2 compression</w:t>
-      </w:r>
-      <w:r>
-        <w:t xml:space="preserve"> </w:t>
-      </w:r>
-      <w:r>
-        <w:t xml:space="preserve">fracture; the latter was an incidental finding with no associated</w:t>
-      </w:r>
-      <w:r>
-        <w:t xml:space="preserve"> </w:t>
-      </w:r>
-      <w:r>
-        <w:t xml:space="preserve">neurological symptoms and was attributed to osteoporotic changes in the</w:t>
-      </w:r>
-      <w:r>
-        <w:t xml:space="preserve"> </w:t>
-      </w:r>
-      <w:r>
-        <w:t xml:space="preserve">absence of any primary malignancy identified on imaging. The patient was</w:t>
+        <w:t xml:space="preserve">(Figure 2). Additional findings included a left renal calculus and an incidental L2</w:t>
+      </w:r>
+      <w:r>
+        <w:t xml:space="preserve"> </w:t>
+      </w:r>
+      <w:r>
+        <w:t xml:space="preserve">compression fracture without neurological symptoms; its aetiology was</w:t>
+      </w:r>
+      <w:r>
+        <w:t xml:space="preserve"> </w:t>
+      </w:r>
+      <w:r>
+        <w:t xml:space="preserve">not further evaluated and was presumed degenerative. The patient was</w:t>
       </w:r>
       <w:r>
         <w:t xml:space="preserve"> </w:t>
@@ -655,13 +649,13 @@
         <w:t xml:space="preserve"> </w:t>
       </w:r>
       <w:r>
-        <w:t xml:space="preserve">guide surgical decision-making. Urology consultation with independent CT review identified Grade 3 left</w:t>
-      </w:r>
-      <w:r>
-        <w:t xml:space="preserve"> </w:t>
-      </w:r>
-      <w:r>
-        <w:t xml:space="preserve">hydronephrosis (Society of Fetal Urology grading) — not documented in</w:t>
+        <w:t xml:space="preserve">guide surgical decision-making. Urology consultation with independent CT review identified</w:t>
+      </w:r>
+      <w:r>
+        <w:t xml:space="preserve"> </w:t>
+      </w:r>
+      <w:r>
+        <w:t xml:space="preserve">moderate-to-severe left hydronephrosis — not documented in</w:t>
       </w:r>
       <w:r>
         <w:t xml:space="preserve"> </w:t>
@@ -705,7 +699,7 @@
         <w:t xml:space="preserve"> </w:t>
       </w:r>
       <w:r>
-        <w:t xml:space="preserve">pelvic floor mass with Grade 3 left hydronephrosis, consistent with the</w:t>
+        <w:t xml:space="preserve">pelvic floor mass with moderate-to-severe left hydronephrosis, consistent with the</w:t>
       </w:r>
       <w:r>
         <w:t xml:space="preserve"> </w:t>
@@ -797,37 +791,37 @@
         <w:t xml:space="preserve"> </w:t>
       </w:r>
       <w:r>
-        <w:t xml:space="preserve">fragments measuring up to 10.0 × 3.0 × 0.5 cm. Histopathology</w:t>
-      </w:r>
-      <w:r>
-        <w:t xml:space="preserve"> </w:t>
-      </w:r>
-      <w:r>
-        <w:t xml:space="preserve">demonstrated a fibrous cystic wall lined by stratified squamous</w:t>
-      </w:r>
-      <w:r>
-        <w:t xml:space="preserve"> </w:t>
-      </w:r>
-      <w:r>
-        <w:t xml:space="preserve">epithelium with keratin fragments (Figure 1). No hair follicles,</w:t>
-      </w:r>
-      <w:r>
-        <w:t xml:space="preserve"> </w:t>
-      </w:r>
-      <w:r>
-        <w:t xml:space="preserve">sebaceous glands, or nuclear atypia were identified. The final</w:t>
-      </w:r>
-      <w:r>
-        <w:t xml:space="preserve"> </w:t>
-      </w:r>
-      <w:r>
-        <w:t xml:space="preserve">pathological diagnosis was epidermoid cyst. The clinical timeline is</w:t>
-      </w:r>
-      <w:r>
-        <w:t xml:space="preserve"> </w:t>
-      </w:r>
-      <w:r>
-        <w:t xml:space="preserve">summarised in Table 1.</w:t>
+        <w:t xml:space="preserve">fragments measuring up to 10.0 × 3.0 × 0.5 cm. Microscopic examination</w:t>
+      </w:r>
+      <w:r>
+        <w:t xml:space="preserve"> </w:t>
+      </w:r>
+      <w:r>
+        <w:t xml:space="preserve">demonstrated keratin fragments and a fibrous cystic wall lined by</w:t>
+      </w:r>
+      <w:r>
+        <w:t xml:space="preserve"> </w:t>
+      </w:r>
+      <w:r>
+        <w:t xml:space="preserve">stratified squamous epithelium (Figure 1). The final pathological</w:t>
+      </w:r>
+      <w:r>
+        <w:t xml:space="preserve"> </w:t>
+      </w:r>
+      <w:r>
+        <w:t xml:space="preserve">diagnosis was epidermoid cyst; unlike a dermoid cyst, no hair follicles</w:t>
+      </w:r>
+      <w:r>
+        <w:t xml:space="preserve"> </w:t>
+      </w:r>
+      <w:r>
+        <w:t xml:space="preserve">or sebaceous glands were present. The clinical timeline is summarised in</w:t>
+      </w:r>
+      <w:r>
+        <w:t xml:space="preserve"> </w:t>
+      </w:r>
+      <w:r>
+        <w:t xml:space="preserve">Table 1.</w:t>
       </w:r>
     </w:p>
     <w:p>
@@ -1062,13 +1056,37 @@
         <w:t xml:space="preserve"> </w:t>
       </w:r>
       <w:r>
-        <w:t xml:space="preserve">than true metastasis — an interpretation consistent with uniformly</w:t>
-      </w:r>
-      <w:r>
-        <w:t xml:space="preserve"> </w:t>
-      </w:r>
-      <w:r>
-        <w:t xml:space="preserve">normal tumor markers and pathological absence of malignancy. As neither</w:t>
+        <w:t xml:space="preserve">than true metastasis — an interpretation consistent with the mild</w:t>
+      </w:r>
+      <w:r>
+        <w:t xml:space="preserve"> </w:t>
+      </w:r>
+      <w:r>
+        <w:t xml:space="preserve">leukocytosis and CRP elevation, uniformly normal tumor markers, and</w:t>
+      </w:r>
+      <w:r>
+        <w:t xml:space="preserve"> </w:t>
+      </w:r>
+      <w:r>
+        <w:t xml:space="preserve">pathological absence of malignancy. Notably,</w:t>
+      </w:r>
+      <w:r>
+        <w:t xml:space="preserve"> </w:t>
+      </w:r>
+      <w:r>
+        <w:t xml:space="preserve">these nodes were contralateral to the left-sided mass,</w:t>
+      </w:r>
+      <w:r>
+        <w:t xml:space="preserve"> </w:t>
+      </w:r>
+      <w:r>
+        <w:t xml:space="preserve">arguing against direct compression and favouring a reactive</w:t>
+      </w:r>
+      <w:r>
+        <w:t xml:space="preserve"> </w:t>
+      </w:r>
+      <w:r>
+        <w:t xml:space="preserve">interpretation. As neither</w:t>
       </w:r>
       <w:r>
         <w:t xml:space="preserve"> </w:t>
@@ -1274,7 +1292,19 @@
         <w:t xml:space="preserve"> </w:t>
       </w:r>
       <w:r>
-        <w:t xml:space="preserve">and post-operative recovery was uneventful. Prognosis following complete</w:t>
+        <w:t xml:space="preserve">and post-operative recovery was uneventful. This decompression</w:t>
+      </w:r>
+      <w:r>
+        <w:t xml:space="preserve"> </w:t>
+      </w:r>
+      <w:r>
+        <w:t xml:space="preserve">presupposed a benign cyst; had malignancy not been excluded, aspiration</w:t>
+      </w:r>
+      <w:r>
+        <w:t xml:space="preserve"> </w:t>
+      </w:r>
+      <w:r>
+        <w:t xml:space="preserve">would have risked tumour spillage. Prognosis following complete</w:t>
       </w:r>
       <w:r>
         <w:t xml:space="preserve"> </w:t>
@@ -1316,13 +1346,19 @@
         <w:t xml:space="preserve"> </w:t>
       </w:r>
       <w:r>
-        <w:t xml:space="preserve">emphasizing the importance of complete pathological sampling and</w:t>
-      </w:r>
-      <w:r>
-        <w:t xml:space="preserve"> </w:t>
-      </w:r>
-      <w:r>
-        <w:t xml:space="preserve">long-term follow-up.</w:t>
+        <w:t xml:space="preserve">emphasizing the importance of complete pathological sampling,</w:t>
+      </w:r>
+      <w:r>
+        <w:t xml:space="preserve"> </w:t>
+      </w:r>
+      <w:r>
+        <w:t xml:space="preserve">long-term follow-up, and caution when forgoing pre-operative tissue</w:t>
+      </w:r>
+      <w:r>
+        <w:t xml:space="preserve"> </w:t>
+      </w:r>
+      <w:r>
+        <w:t xml:space="preserve">diagnosis.</w:t>
       </w:r>
       <w:r>
         <w:rPr>
@@ -1378,31 +1414,7 @@
         <w:t xml:space="preserve"> </w:t>
       </w:r>
       <w:r>
-        <w:t xml:space="preserve">squamous lining in the present case excludes this entity. The absence of</w:t>
-      </w:r>
-      <w:r>
-        <w:t xml:space="preserve"> </w:t>
-      </w:r>
-      <w:r>
-        <w:t xml:space="preserve">adnexal structures confirms the diagnosis of epidermoid cyst over</w:t>
-      </w:r>
-      <w:r>
-        <w:t xml:space="preserve"> </w:t>
-      </w:r>
-      <w:r>
-        <w:t xml:space="preserve">dermoid cyst. Mesothelioma is excluded by the squamous epithelial</w:t>
-      </w:r>
-      <w:r>
-        <w:t xml:space="preserve"> </w:t>
-      </w:r>
-      <w:r>
-        <w:t xml:space="preserve">lining; mesothelioma demonstrates a mesothelial lining positive for</w:t>
-      </w:r>
-      <w:r>
-        <w:t xml:space="preserve"> </w:t>
-      </w:r>
-      <w:r>
-        <w:t xml:space="preserve">calretinin and WT-1 on immunohistochemistry.</w:t>
+        <w:t xml:space="preserve">squamous lining in the present case excludes this entity.</w:t>
       </w:r>
     </w:p>
     <w:p>
@@ -1434,19 +1446,37 @@
         <w:t xml:space="preserve"> </w:t>
       </w:r>
       <w:r>
-        <w:t xml:space="preserve">and therapeutic — a limitation that should be recognised in the absence</w:t>
-      </w:r>
-      <w:r>
-        <w:t xml:space="preserve"> </w:t>
-      </w:r>
-      <w:r>
-        <w:t xml:space="preserve">of pre-operative histological confirmation. The reactive interpretation</w:t>
-      </w:r>
-      <w:r>
-        <w:t xml:space="preserve"> </w:t>
-      </w:r>
-      <w:r>
-        <w:t xml:space="preserve">of regional lymphadenopathy remains inferential.</w:t>
+        <w:t xml:space="preserve">and therapeutic. MRI was not performed, limiting assessment of the</w:t>
+      </w:r>
+      <w:r>
+        <w:t xml:space="preserve"> </w:t>
+      </w:r>
+      <w:r>
+        <w:t xml:space="preserve">lesion’s compartment of origin and regional nodes. Follow-up was</w:t>
+      </w:r>
+      <w:r>
+        <w:t xml:space="preserve"> </w:t>
+      </w:r>
+      <w:r>
+        <w:t xml:space="preserve">limited to the index admission; no surveillance data beyond discharge</w:t>
+      </w:r>
+      <w:r>
+        <w:t xml:space="preserve"> </w:t>
+      </w:r>
+      <w:r>
+        <w:t xml:space="preserve">are available, precluding confirmation of freedom from recurrence.</w:t>
+      </w:r>
+      <w:r>
+        <w:t xml:space="preserve"> </w:t>
+      </w:r>
+      <w:r>
+        <w:t xml:space="preserve">The reactive interpretation of regional lymphadenopathy remains</w:t>
+      </w:r>
+      <w:r>
+        <w:t xml:space="preserve"> </w:t>
+      </w:r>
+      <w:r>
+        <w:t xml:space="preserve">inferential.</w:t>
       </w:r>
     </w:p>
     <w:p>
@@ -1491,19 +1521,43 @@
         <w:t xml:space="preserve"> </w:t>
       </w:r>
       <w:r>
-        <w:t xml:space="preserve">of epidermoid cyst in the differential and proceed to surgical excision</w:t>
-      </w:r>
-      <w:r>
-        <w:t xml:space="preserve"> </w:t>
-      </w:r>
-      <w:r>
-        <w:t xml:space="preserve">for histopathological confirmation. Prophylactic ureteral stenting should be considered when the mass is in</w:t>
-      </w:r>
-      <w:r>
-        <w:t xml:space="preserve"> </w:t>
-      </w:r>
-      <w:r>
-        <w:t xml:space="preserve">proximity to the ureter. Complete excision is curative.</w:t>
+        <w:t xml:space="preserve">of epidermoid cyst in the differential of an extrinsic pelvic mass;</w:t>
+      </w:r>
+      <w:r>
+        <w:t xml:space="preserve"> </w:t>
+      </w:r>
+      <w:r>
+        <w:t xml:space="preserve">because non-enhancement does not exclude a cystic malignancy, definitive</w:t>
+      </w:r>
+      <w:r>
+        <w:t xml:space="preserve"> </w:t>
+      </w:r>
+      <w:r>
+        <w:t xml:space="preserve">diagnosis rests on histopathology of the excised specimen.</w:t>
+      </w:r>
+      <w:r>
+        <w:t xml:space="preserve"> </w:t>
+      </w:r>
+      <w:r>
+        <w:t xml:space="preserve">Prophylactic ureteral stenting should be considered when the mass lies</w:t>
+      </w:r>
+      <w:r>
+        <w:t xml:space="preserve"> </w:t>
+      </w:r>
+      <w:r>
+        <w:t xml:space="preserve">in proximity to the ureter. Complete excision offers an excellent</w:t>
+      </w:r>
+      <w:r>
+        <w:t xml:space="preserve"> </w:t>
+      </w:r>
+      <w:r>
+        <w:t xml:space="preserve">prognosis, though follow-up is required to confirm absence of</w:t>
+      </w:r>
+      <w:r>
+        <w:t xml:space="preserve"> </w:t>
+      </w:r>
+      <w:r>
+        <w:t xml:space="preserve">recurrence.</w:t>
       </w:r>
     </w:p>
     <w:p>
@@ -1943,7 +1997,7 @@
               <w:pStyle w:val="Compact"/>
             </w:pPr>
             <w:r>
-              <w:t xml:space="preserve">Colonoscopy: no mucosal lesion; tumour markers (AFP, CEA, CA19-9): within normal limits; urology consultation — Grade 3 left hydronephrosis identified on CT review (not in formal radiology report); cardiac and pulmonary pre-operative evaluation: low surgical risk</w:t>
+              <w:t xml:space="preserve">Colonoscopy: no mucosal lesion; tumour markers (AFP, CEA, CA19-9): within normal limits; urology consultation — moderate-to-severe left hydronephrosis identified on CT review (not in formal radiology report); cardiac and pulmonary pre-operative evaluation: low surgical risk</w:t>
             </w:r>
           </w:p>
         </w:tc>
@@ -1967,7 +2021,7 @@
               <w:pStyle w:val="Compact"/>
             </w:pPr>
             <w:r>
-              <w:t xml:space="preserve">Cystoscopic Double-J ureteral stenting + laparotomy; complete excision of pelvic floor cyst; Grade 3 left hydronephrosis confirmed intraoperatively</w:t>
+              <w:t xml:space="preserve">Cystoscopic Double-J ureteral stenting + laparotomy; complete excision of pelvic floor cyst; moderate-to-severe left hydronephrosis confirmed intraoperatively</w:t>
             </w:r>
           </w:p>
         </w:tc>
@@ -2113,37 +2167,79 @@
         <w:pStyle w:val="BodyText"/>
       </w:pPr>
       <w:r>
-        <w:t xml:space="preserve">Figure 1. Histopathological section of the excised pelvic floor mass</w:t>
-      </w:r>
-      <w:r>
-        <w:t xml:space="preserve"> </w:t>
-      </w:r>
-      <w:r>
-        <w:t xml:space="preserve">(hematoxylin and eosin stain). The cyst wall is composed of dense</w:t>
-      </w:r>
-      <w:r>
-        <w:t xml:space="preserve"> </w:t>
-      </w:r>
-      <w:r>
-        <w:t xml:space="preserve">fibrous tissue lined by stratified squamous epithelium with a granular</w:t>
-      </w:r>
-      <w:r>
-        <w:t xml:space="preserve"> </w:t>
-      </w:r>
-      <w:r>
-        <w:t xml:space="preserve">layer. The cyst lumen contains laminated keratin fragments. No hair</w:t>
-      </w:r>
-      <w:r>
-        <w:t xml:space="preserve"> </w:t>
-      </w:r>
-      <w:r>
-        <w:t xml:space="preserve">follicles or sebaceous glands are identified, consistent with an</w:t>
-      </w:r>
-      <w:r>
-        <w:t xml:space="preserve"> </w:t>
-      </w:r>
-      <w:r>
-        <w:t xml:space="preserve">epidermoid cyst.</w:t>
+        <w:t xml:space="preserve">Figure 1. Histopathology of the excised pelvic floor mass (hematoxylin</w:t>
+      </w:r>
+      <w:r>
+        <w:t xml:space="preserve"> </w:t>
+      </w:r>
+      <w:r>
+        <w:t xml:space="preserve">and eosin stain). (A) Low-power overview (1×; scale bar, 2 mm) showing</w:t>
+      </w:r>
+      <w:r>
+        <w:t xml:space="preserve"> </w:t>
+      </w:r>
+      <w:r>
+        <w:t xml:space="preserve">the collapsed cyst wall folded upon itself — a thin stratified squamous</w:t>
+      </w:r>
+      <w:r>
+        <w:t xml:space="preserve"> </w:t>
+      </w:r>
+      <w:r>
+        <w:t xml:space="preserve">epithelial lining overlying a fibrous wall, with abundant laminated</w:t>
+      </w:r>
+      <w:r>
+        <w:t xml:space="preserve"> </w:t>
+      </w:r>
+      <w:r>
+        <w:t xml:space="preserve">keratin; the lumen is largely empty following intraoperative</w:t>
+      </w:r>
+      <w:r>
+        <w:t xml:space="preserve"> </w:t>
+      </w:r>
+      <w:r>
+        <w:t xml:space="preserve">decompression. (B) The keratin consists of loose, wavy, lamellated</w:t>
+      </w:r>
+      <w:r>
+        <w:t xml:space="preserve"> </w:t>
+      </w:r>
+      <w:r>
+        <w:t xml:space="preserve">eosinophilic debris (4×; scale bar, 500 µm). (C) The cyst is lined by</w:t>
+      </w:r>
+      <w:r>
+        <w:t xml:space="preserve"> </w:t>
+      </w:r>
+      <w:r>
+        <w:t xml:space="preserve">stratified squamous epithelium overlying a dense fibrous wall containing</w:t>
+      </w:r>
+      <w:r>
+        <w:t xml:space="preserve"> </w:t>
+      </w:r>
+      <w:r>
+        <w:t xml:space="preserve">congested blood vessels (4×; scale bar, 500 µm). (D) Higher</w:t>
+      </w:r>
+      <w:r>
+        <w:t xml:space="preserve"> </w:t>
+      </w:r>
+      <w:r>
+        <w:t xml:space="preserve">magnification confirms the stratified squamous lining with a well-formed</w:t>
+      </w:r>
+      <w:r>
+        <w:t xml:space="preserve"> </w:t>
+      </w:r>
+      <w:r>
+        <w:t xml:space="preserve">granular layer and surface lamellar keratinization. No adnexal structures are</w:t>
+      </w:r>
+      <w:r>
+        <w:t xml:space="preserve"> </w:t>
+      </w:r>
+      <w:r>
+        <w:t xml:space="preserve">seen in the fields shown, consistent with an epidermoid cyst rather than</w:t>
+      </w:r>
+      <w:r>
+        <w:t xml:space="preserve"> </w:t>
+      </w:r>
+      <w:r>
+        <w:t xml:space="preserve">a dermoid (mature cystic teratoma) (10×; scale bar, 200 µm).</w:t>
       </w:r>
     </w:p>
     <w:p>
@@ -2242,13 +2338,19 @@
         <w:t xml:space="preserve"> </w:t>
       </w:r>
       <w:r>
-        <w:t xml:space="preserve">the Declaration of Helsinki. Institutional review board approval was</w:t>
-      </w:r>
-      <w:r>
-        <w:t xml:space="preserve"> </w:t>
-      </w:r>
-      <w:r>
-        <w:t xml:space="preserve">obtained / waived for case reports at the reporting institution.</w:t>
+        <w:t xml:space="preserve">the Declaration of Helsinki. Institutional review board approval for</w:t>
+      </w:r>
+      <w:r>
+        <w:t xml:space="preserve"> </w:t>
+      </w:r>
+      <w:r>
+        <w:t xml:space="preserve">this case report was obtained from the Institutional Review Board of</w:t>
+      </w:r>
+      <w:r>
+        <w:t xml:space="preserve"> </w:t>
+      </w:r>
+      <w:r>
+        <w:t xml:space="preserve">Xizhi Cathay General Hospital (approval number: CGH-P115074).</w:t>
       </w:r>
     </w:p>
     <w:p>
@@ -2408,6 +2510,26 @@
       </w:pPr>
       <w:r>
         <w:t xml:space="preserve">Conflict of Interest: The authors declare no conflicts of interest.</w:t>
+      </w:r>
+    </w:p>
+    <w:p>
+      <w:pPr>
+        <w:pStyle w:val="BodyText"/>
+      </w:pPr>
+      <w:r>
+        <w:t xml:space="preserve">Guarantor: Chen Shu-Hung (corresponding author) accepts full</w:t>
+      </w:r>
+      <w:r>
+        <w:t xml:space="preserve"> </w:t>
+      </w:r>
+      <w:r>
+        <w:t xml:space="preserve">responsibility for the work, had access to the data, and controlled the</w:t>
+      </w:r>
+      <w:r>
+        <w:t xml:space="preserve"> </w:t>
+      </w:r>
+      <w:r>
+        <w:t xml:space="preserve">decision to publish.</w:t>
       </w:r>
     </w:p>
     <w:p>

</xml_diff>